<commit_message>
Better schedules and more backup file chunks
</commit_message>
<xml_diff>
--- a/docs/automation_concept.docx
+++ b/docs/automation_concept.docx
@@ -5,6 +5,10 @@
     <w:p>
       <w:pPr>
         <w:pStyle w:val="Heading1"/>
+        <w:numPr>
+          <w:ilvl w:val="0"/>
+          <w:numId w:val="1"/>
+        </w:numPr>
         <w:bidi w:val="0"/>
         <w:spacing w:before="240" w:after="120"/>
         <w:jc w:val="left"/>
@@ -12,11 +16,7 @@
       </w:pPr>
       <w:r>
         <w:rPr/>
-        <w:t xml:space="preserve">Automation </w:t>
-      </w:r>
-      <w:r>
-        <w:rPr/>
-        <w:t>concept</w:t>
+        <w:t>Automation concept</w:t>
       </w:r>
     </w:p>
     <w:p>
@@ -37,6 +37,7 @@
         <w:jc w:val="left"/>
         <w:rPr>
           <w:rFonts w:ascii="Droid Sans Mono;monospace;monospace" w:hAnsi="Droid Sans Mono;monospace;monospace"/>
+          <w:b w:val="false"/>
           <w:b w:val="false"/>
           <w:color w:val="3B3B3B"/>
           <w:sz w:val="21"/>
@@ -62,6 +63,7 @@
         <w:rPr>
           <w:rFonts w:ascii="Droid Sans Mono;monospace;monospace" w:hAnsi="Droid Sans Mono;monospace;monospace"/>
           <w:b w:val="false"/>
+          <w:b w:val="false"/>
           <w:color w:val="3B3B3B"/>
           <w:sz w:val="21"/>
           <w:shd w:fill="FFFFFF" w:val="clear"/>
@@ -84,6 +86,7 @@
         <w:jc w:val="left"/>
         <w:rPr>
           <w:rFonts w:ascii="Droid Sans Mono;monospace;monospace" w:hAnsi="Droid Sans Mono;monospace;monospace"/>
+          <w:b w:val="false"/>
           <w:b w:val="false"/>
           <w:color w:val="3B3B3B"/>
           <w:sz w:val="21"/>
@@ -109,6 +112,7 @@
         <w:rPr>
           <w:rFonts w:ascii="Droid Sans Mono;monospace;monospace" w:hAnsi="Droid Sans Mono;monospace;monospace"/>
           <w:b w:val="false"/>
+          <w:b w:val="false"/>
           <w:color w:val="3B3B3B"/>
           <w:sz w:val="21"/>
           <w:shd w:fill="FFFFFF" w:val="clear"/>
@@ -127,6 +131,10 @@
     <w:p>
       <w:pPr>
         <w:pStyle w:val="Heading2"/>
+        <w:numPr>
+          <w:ilvl w:val="1"/>
+          <w:numId w:val="1"/>
+        </w:numPr>
         <w:bidi w:val="0"/>
         <w:jc w:val="left"/>
         <w:rPr/>
@@ -143,6 +151,7 @@
         <w:jc w:val="left"/>
         <w:rPr>
           <w:rFonts w:ascii="Droid Sans Mono;monospace;monospace" w:hAnsi="Droid Sans Mono;monospace;monospace"/>
+          <w:b w:val="false"/>
           <w:b w:val="false"/>
           <w:color w:val="3B3B3B"/>
           <w:sz w:val="21"/>
@@ -162,6 +171,10 @@
     <w:p>
       <w:pPr>
         <w:pStyle w:val="Heading3"/>
+        <w:numPr>
+          <w:ilvl w:val="2"/>
+          <w:numId w:val="1"/>
+        </w:numPr>
         <w:bidi w:val="0"/>
         <w:jc w:val="left"/>
         <w:rPr/>
@@ -173,7 +186,7 @@
     </w:p>
     <w:tbl>
       <w:tblPr>
-        <w:tblW w:w="5000" w:type="pct"/>
+        <w:tblW w:w="9645" w:type="dxa"/>
         <w:jc w:val="left"/>
         <w:tblInd w:w="-5" w:type="dxa"/>
         <w:tblLayout w:type="fixed"/>
@@ -186,7 +199,9 @@
       </w:tblPr>
       <w:tblGrid>
         <w:gridCol w:w="1588"/>
-        <w:gridCol w:w="8050"/>
+        <w:gridCol w:w="3797"/>
+        <w:gridCol w:w="1569"/>
+        <w:gridCol w:w="2691"/>
       </w:tblGrid>
       <w:tr>
         <w:trPr/>
@@ -202,6 +217,7 @@
           <w:p>
             <w:pPr>
               <w:pStyle w:val="TableContents"/>
+              <w:widowControl w:val="false"/>
               <w:bidi w:val="0"/>
               <w:jc w:val="left"/>
               <w:rPr>
@@ -243,7 +259,128 @@
         </w:tc>
         <w:tc>
           <w:tcPr>
-            <w:tcW w:w="8050" w:type="dxa"/>
+            <w:tcW w:w="3797" w:type="dxa"/>
+            <w:tcBorders>
+              <w:top w:val="single" w:sz="4" w:space="0" w:color="000000"/>
+              <w:left w:val="single" w:sz="4" w:space="0" w:color="000000"/>
+              <w:bottom w:val="single" w:sz="4" w:space="0" w:color="000000"/>
+            </w:tcBorders>
+          </w:tcPr>
+          <w:p>
+            <w:pPr>
+              <w:pStyle w:val="TableContents"/>
+              <w:widowControl w:val="false"/>
+              <w:bidi w:val="0"/>
+              <w:jc w:val="left"/>
+              <w:rPr>
+                <w:rFonts w:ascii="Liberation Serif" w:hAnsi="Liberation Serif"/>
+                <w:b w:val="false"/>
+                <w:b w:val="false"/>
+                <w:bCs w:val="false"/>
+                <w:i w:val="false"/>
+                <w:i w:val="false"/>
+                <w:iCs w:val="false"/>
+                <w:strike w:val="false"/>
+                <w:dstrike w:val="false"/>
+                <w:outline w:val="false"/>
+                <w:shadow w:val="false"/>
+                <w:color w:val="000000"/>
+                <w:sz w:val="24"/>
+                <w:szCs w:val="24"/>
+                <w:u w:val="none"/>
+              </w:rPr>
+            </w:pPr>
+            <w:r>
+              <w:rPr>
+                <w:b w:val="false"/>
+                <w:bCs w:val="false"/>
+                <w:i w:val="false"/>
+                <w:iCs w:val="false"/>
+                <w:strike w:val="false"/>
+                <w:dstrike w:val="false"/>
+                <w:outline w:val="false"/>
+                <w:shadow w:val="false"/>
+                <w:color w:val="000000"/>
+                <w:sz w:val="24"/>
+                <w:szCs w:val="24"/>
+                <w:u w:val="none"/>
+              </w:rPr>
+              <w:t xml:space="preserve">1 </w:t>
+            </w:r>
+            <w:r>
+              <w:rPr>
+                <w:b w:val="false"/>
+                <w:bCs w:val="false"/>
+                <w:i w:val="false"/>
+                <w:iCs w:val="false"/>
+                <w:strike w:val="false"/>
+                <w:dstrike w:val="false"/>
+                <w:outline w:val="false"/>
+                <w:shadow w:val="false"/>
+                <w:color w:val="000000"/>
+                <w:sz w:val="24"/>
+                <w:szCs w:val="24"/>
+                <w:u w:val="none"/>
+              </w:rPr>
+              <w:t>x hour</w:t>
+            </w:r>
+          </w:p>
+        </w:tc>
+        <w:tc>
+          <w:tcPr>
+            <w:tcW w:w="1569" w:type="dxa"/>
+            <w:tcBorders>
+              <w:top w:val="single" w:sz="4" w:space="0" w:color="000000"/>
+              <w:left w:val="single" w:sz="4" w:space="0" w:color="000000"/>
+              <w:bottom w:val="single" w:sz="4" w:space="0" w:color="000000"/>
+            </w:tcBorders>
+          </w:tcPr>
+          <w:p>
+            <w:pPr>
+              <w:pStyle w:val="TableContents"/>
+              <w:widowControl w:val="false"/>
+              <w:bidi w:val="0"/>
+              <w:jc w:val="left"/>
+              <w:rPr>
+                <w:rFonts w:ascii="Liberation Serif" w:hAnsi="Liberation Serif"/>
+                <w:b/>
+                <w:b/>
+                <w:bCs/>
+                <w:i w:val="false"/>
+                <w:i w:val="false"/>
+                <w:iCs w:val="false"/>
+                <w:strike w:val="false"/>
+                <w:dstrike w:val="false"/>
+                <w:outline w:val="false"/>
+                <w:shadow w:val="false"/>
+                <w:color w:val="000000"/>
+                <w:sz w:val="24"/>
+                <w:szCs w:val="24"/>
+                <w:u w:val="none"/>
+              </w:rPr>
+            </w:pPr>
+            <w:r>
+              <w:rPr>
+                <w:b/>
+                <w:bCs/>
+                <w:i w:val="false"/>
+                <w:iCs w:val="false"/>
+                <w:strike w:val="false"/>
+                <w:dstrike w:val="false"/>
+                <w:outline w:val="false"/>
+                <w:shadow w:val="false"/>
+                <w:color w:val="000000"/>
+                <w:sz w:val="24"/>
+                <w:szCs w:val="24"/>
+                <w:u w:val="none"/>
+              </w:rPr>
+              <w:t>Duration</w:t>
+            </w:r>
+          </w:p>
+        </w:tc>
+        <w:tc>
+          <w:tcPr>
+            <w:tcW w:w="2691" w:type="dxa"/>
             <w:tcBorders>
               <w:top w:val="single" w:sz="4" w:space="0" w:color="000000"/>
               <w:left w:val="single" w:sz="4" w:space="0" w:color="000000"/>
@@ -254,6 +391,7 @@
           <w:p>
             <w:pPr>
               <w:pStyle w:val="TableContents"/>
+              <w:widowControl w:val="false"/>
               <w:bidi w:val="0"/>
               <w:jc w:val="left"/>
               <w:rPr>
@@ -289,7 +427,7 @@
                 <w:szCs w:val="24"/>
                 <w:u w:val="none"/>
               </w:rPr>
-              <w:t>1 x day</w:t>
+              <w:t>00h06</w:t>
             </w:r>
           </w:p>
         </w:tc>
@@ -307,6 +445,7 @@
           <w:p>
             <w:pPr>
               <w:pStyle w:val="TableContents"/>
+              <w:widowControl w:val="false"/>
               <w:bidi w:val="0"/>
               <w:jc w:val="left"/>
               <w:rPr>
@@ -348,7 +487,8 @@
         </w:tc>
         <w:tc>
           <w:tcPr>
-            <w:tcW w:w="8050" w:type="dxa"/>
+            <w:tcW w:w="8057" w:type="dxa"/>
+            <w:gridSpan w:val="3"/>
             <w:tcBorders>
               <w:left w:val="single" w:sz="4" w:space="0" w:color="000000"/>
               <w:bottom w:val="single" w:sz="4" w:space="0" w:color="000000"/>
@@ -358,6 +498,11 @@
           <w:p>
             <w:pPr>
               <w:pStyle w:val="TableContents"/>
+              <w:widowControl w:val="false"/>
+              <w:numPr>
+                <w:ilvl w:val="0"/>
+                <w:numId w:val="5"/>
+              </w:numPr>
               <w:bidi w:val="0"/>
               <w:jc w:val="left"/>
               <w:rPr>
@@ -393,7 +538,89 @@
                 <w:szCs w:val="24"/>
                 <w:u w:val="none"/>
               </w:rPr>
-              <w:t>None</w:t>
+              <w:t>P</w:t>
+            </w:r>
+            <w:r>
+              <w:rPr>
+                <w:b w:val="false"/>
+                <w:bCs w:val="false"/>
+                <w:i w:val="false"/>
+                <w:iCs w:val="false"/>
+                <w:strike w:val="false"/>
+                <w:dstrike w:val="false"/>
+                <w:outline w:val="false"/>
+                <w:shadow w:val="false"/>
+                <w:color w:val="000000"/>
+                <w:sz w:val="24"/>
+                <w:szCs w:val="24"/>
+                <w:u w:val="none"/>
+              </w:rPr>
+              <w:t>arameters to be set in .env</w:t>
+              <w:br/>
+              <w:t>BASE_DATA_DIRECTORY:  T</w:t>
+            </w:r>
+            <w:r>
+              <w:rPr>
+                <w:b w:val="false"/>
+                <w:bCs w:val="false"/>
+                <w:i/>
+                <w:iCs/>
+                <w:strike w:val="false"/>
+                <w:dstrike w:val="false"/>
+                <w:outline w:val="false"/>
+                <w:shadow w:val="false"/>
+                <w:color w:val="000000"/>
+                <w:sz w:val="24"/>
+                <w:szCs w:val="24"/>
+                <w:u w:val="none"/>
+              </w:rPr>
+              <w:t>he directory that will be scanned for new files</w:t>
+            </w:r>
+          </w:p>
+          <w:p>
+            <w:pPr>
+              <w:pStyle w:val="TableContents"/>
+              <w:widowControl w:val="false"/>
+              <w:numPr>
+                <w:ilvl w:val="0"/>
+                <w:numId w:val="5"/>
+              </w:numPr>
+              <w:bidi w:val="0"/>
+              <w:jc w:val="left"/>
+              <w:rPr>
+                <w:rFonts w:ascii="Liberation Serif" w:hAnsi="Liberation Serif"/>
+                <w:b w:val="false"/>
+                <w:b w:val="false"/>
+                <w:bCs w:val="false"/>
+                <w:i w:val="false"/>
+                <w:i w:val="false"/>
+                <w:iCs w:val="false"/>
+                <w:strike w:val="false"/>
+                <w:dstrike w:val="false"/>
+                <w:outline w:val="false"/>
+                <w:shadow w:val="false"/>
+                <w:color w:val="000000"/>
+                <w:sz w:val="24"/>
+                <w:szCs w:val="24"/>
+                <w:u w:val="none"/>
+              </w:rPr>
+            </w:pPr>
+            <w:r>
+              <w:rPr>
+                <w:b w:val="false"/>
+                <w:bCs w:val="false"/>
+                <w:i w:val="false"/>
+                <w:iCs w:val="false"/>
+                <w:strike w:val="false"/>
+                <w:dstrike w:val="false"/>
+                <w:outline w:val="false"/>
+                <w:shadow w:val="false"/>
+                <w:color w:val="000000"/>
+                <w:sz w:val="24"/>
+                <w:szCs w:val="24"/>
+                <w:u w:val="none"/>
+              </w:rPr>
+              <w:t>The initial run may take hours. So trigger the first run manually. After that, only directories containing new files will be scanned. You might want to stop the DAG if uploading a large quantity of files.</w:t>
             </w:r>
           </w:p>
         </w:tc>
@@ -411,6 +638,7 @@
           <w:p>
             <w:pPr>
               <w:pStyle w:val="TableContents"/>
+              <w:widowControl w:val="false"/>
               <w:bidi w:val="0"/>
               <w:jc w:val="left"/>
               <w:rPr>
@@ -452,7 +680,8 @@
         </w:tc>
         <w:tc>
           <w:tcPr>
-            <w:tcW w:w="8050" w:type="dxa"/>
+            <w:tcW w:w="8057" w:type="dxa"/>
+            <w:gridSpan w:val="3"/>
             <w:tcBorders>
               <w:left w:val="single" w:sz="4" w:space="0" w:color="000000"/>
               <w:bottom w:val="single" w:sz="4" w:space="0" w:color="000000"/>
@@ -462,6 +691,7 @@
           <w:p>
             <w:pPr>
               <w:pStyle w:val="TableContents"/>
+              <w:widowControl w:val="false"/>
               <w:numPr>
                 <w:ilvl w:val="0"/>
                 <w:numId w:val="2"/>
@@ -507,6 +737,7 @@
           <w:p>
             <w:pPr>
               <w:pStyle w:val="TableContents"/>
+              <w:widowControl w:val="false"/>
               <w:numPr>
                 <w:ilvl w:val="0"/>
                 <w:numId w:val="2"/>
@@ -552,6 +783,7 @@
           <w:p>
             <w:pPr>
               <w:pStyle w:val="TableContents"/>
+              <w:widowControl w:val="false"/>
               <w:numPr>
                 <w:ilvl w:val="0"/>
                 <w:numId w:val="2"/>
@@ -597,6 +829,7 @@
           <w:p>
             <w:pPr>
               <w:pStyle w:val="TableContents"/>
+              <w:widowControl w:val="false"/>
               <w:numPr>
                 <w:ilvl w:val="0"/>
                 <w:numId w:val="2"/>
@@ -642,6 +875,7 @@
           <w:p>
             <w:pPr>
               <w:pStyle w:val="TableContents"/>
+              <w:widowControl w:val="false"/>
               <w:numPr>
                 <w:ilvl w:val="0"/>
                 <w:numId w:val="2"/>
@@ -699,6 +933,7 @@
           <w:p>
             <w:pPr>
               <w:pStyle w:val="TableContents"/>
+              <w:widowControl w:val="false"/>
               <w:bidi w:val="0"/>
               <w:jc w:val="left"/>
               <w:rPr>
@@ -740,7 +975,8 @@
         </w:tc>
         <w:tc>
           <w:tcPr>
-            <w:tcW w:w="8050" w:type="dxa"/>
+            <w:tcW w:w="8057" w:type="dxa"/>
+            <w:gridSpan w:val="3"/>
             <w:tcBorders>
               <w:left w:val="single" w:sz="4" w:space="0" w:color="000000"/>
               <w:bottom w:val="single" w:sz="4" w:space="0" w:color="000000"/>
@@ -750,6 +986,7 @@
           <w:p>
             <w:pPr>
               <w:pStyle w:val="TableContents"/>
+              <w:widowControl w:val="false"/>
               <w:bidi w:val="0"/>
               <w:jc w:val="left"/>
               <w:rPr>
@@ -798,6 +1035,7 @@
         <w:jc w:val="left"/>
         <w:rPr>
           <w:rFonts w:ascii="Droid Sans Mono;monospace;monospace" w:hAnsi="Droid Sans Mono;monospace;monospace"/>
+          <w:b w:val="false"/>
           <w:b w:val="false"/>
           <w:color w:val="3B3B3B"/>
           <w:sz w:val="21"/>
@@ -822,6 +1060,7 @@
         <w:rPr>
           <w:rFonts w:ascii="Droid Sans Mono;monospace;monospace" w:hAnsi="Droid Sans Mono;monospace;monospace"/>
           <w:b w:val="false"/>
+          <w:b w:val="false"/>
           <w:color w:val="3B3B3B"/>
           <w:sz w:val="21"/>
           <w:shd w:fill="FFFFFF" w:val="clear"/>
@@ -845,6 +1084,7 @@
         <w:rPr>
           <w:rFonts w:ascii="Droid Sans Mono;monospace;monospace" w:hAnsi="Droid Sans Mono;monospace;monospace"/>
           <w:b w:val="false"/>
+          <w:b w:val="false"/>
           <w:color w:val="3B3B3B"/>
           <w:sz w:val="21"/>
           <w:shd w:fill="FFFFFF" w:val="clear"/>
@@ -863,6 +1103,10 @@
     <w:p>
       <w:pPr>
         <w:pStyle w:val="Heading3"/>
+        <w:numPr>
+          <w:ilvl w:val="2"/>
+          <w:numId w:val="1"/>
+        </w:numPr>
         <w:bidi w:val="0"/>
         <w:jc w:val="left"/>
         <w:rPr/>
@@ -874,7 +1118,7 @@
     </w:p>
     <w:tbl>
       <w:tblPr>
-        <w:tblW w:w="5000" w:type="pct"/>
+        <w:tblW w:w="9645" w:type="dxa"/>
         <w:jc w:val="left"/>
         <w:tblInd w:w="-5" w:type="dxa"/>
         <w:tblLayout w:type="fixed"/>
@@ -887,7 +1131,9 @@
       </w:tblPr>
       <w:tblGrid>
         <w:gridCol w:w="1588"/>
-        <w:gridCol w:w="8050"/>
+        <w:gridCol w:w="3797"/>
+        <w:gridCol w:w="1569"/>
+        <w:gridCol w:w="2691"/>
       </w:tblGrid>
       <w:tr>
         <w:trPr/>
@@ -903,6 +1149,7 @@
           <w:p>
             <w:pPr>
               <w:pStyle w:val="TableContents"/>
+              <w:widowControl w:val="false"/>
               <w:bidi w:val="0"/>
               <w:jc w:val="left"/>
               <w:rPr>
@@ -944,7 +1191,111 @@
         </w:tc>
         <w:tc>
           <w:tcPr>
-            <w:tcW w:w="8050" w:type="dxa"/>
+            <w:tcW w:w="3797" w:type="dxa"/>
+            <w:tcBorders>
+              <w:top w:val="single" w:sz="4" w:space="0" w:color="000000"/>
+              <w:left w:val="single" w:sz="4" w:space="0" w:color="000000"/>
+              <w:bottom w:val="single" w:sz="4" w:space="0" w:color="000000"/>
+            </w:tcBorders>
+          </w:tcPr>
+          <w:p>
+            <w:pPr>
+              <w:pStyle w:val="TableContents"/>
+              <w:widowControl w:val="false"/>
+              <w:bidi w:val="0"/>
+              <w:jc w:val="left"/>
+              <w:rPr>
+                <w:rFonts w:ascii="Liberation Serif" w:hAnsi="Liberation Serif"/>
+                <w:b w:val="false"/>
+                <w:b w:val="false"/>
+                <w:bCs w:val="false"/>
+                <w:i w:val="false"/>
+                <w:i w:val="false"/>
+                <w:iCs w:val="false"/>
+                <w:strike w:val="false"/>
+                <w:dstrike w:val="false"/>
+                <w:outline w:val="false"/>
+                <w:shadow w:val="false"/>
+                <w:color w:val="000000"/>
+                <w:sz w:val="24"/>
+                <w:szCs w:val="24"/>
+                <w:u w:val="none"/>
+              </w:rPr>
+            </w:pPr>
+            <w:r>
+              <w:rPr>
+                <w:b w:val="false"/>
+                <w:bCs w:val="false"/>
+                <w:i w:val="false"/>
+                <w:iCs w:val="false"/>
+                <w:strike w:val="false"/>
+                <w:dstrike w:val="false"/>
+                <w:outline w:val="false"/>
+                <w:shadow w:val="false"/>
+                <w:color w:val="000000"/>
+                <w:sz w:val="24"/>
+                <w:szCs w:val="24"/>
+                <w:u w:val="none"/>
+              </w:rPr>
+              <w:t>1 x week</w:t>
+            </w:r>
+          </w:p>
+        </w:tc>
+        <w:tc>
+          <w:tcPr>
+            <w:tcW w:w="1569" w:type="dxa"/>
+            <w:tcBorders>
+              <w:top w:val="single" w:sz="4" w:space="0" w:color="000000"/>
+              <w:left w:val="single" w:sz="4" w:space="0" w:color="000000"/>
+              <w:bottom w:val="single" w:sz="4" w:space="0" w:color="000000"/>
+            </w:tcBorders>
+          </w:tcPr>
+          <w:p>
+            <w:pPr>
+              <w:pStyle w:val="TableContents"/>
+              <w:widowControl w:val="false"/>
+              <w:bidi w:val="0"/>
+              <w:jc w:val="left"/>
+              <w:rPr>
+                <w:rFonts w:ascii="Liberation Serif" w:hAnsi="Liberation Serif"/>
+                <w:b/>
+                <w:b/>
+                <w:bCs/>
+                <w:i w:val="false"/>
+                <w:i w:val="false"/>
+                <w:iCs w:val="false"/>
+                <w:strike w:val="false"/>
+                <w:dstrike w:val="false"/>
+                <w:outline w:val="false"/>
+                <w:shadow w:val="false"/>
+                <w:color w:val="000000"/>
+                <w:sz w:val="24"/>
+                <w:szCs w:val="24"/>
+                <w:u w:val="none"/>
+              </w:rPr>
+            </w:pPr>
+            <w:r>
+              <w:rPr>
+                <w:b/>
+                <w:bCs/>
+                <w:i w:val="false"/>
+                <w:iCs w:val="false"/>
+                <w:strike w:val="false"/>
+                <w:dstrike w:val="false"/>
+                <w:outline w:val="false"/>
+                <w:shadow w:val="false"/>
+                <w:color w:val="000000"/>
+                <w:sz w:val="24"/>
+                <w:szCs w:val="24"/>
+                <w:u w:val="none"/>
+              </w:rPr>
+              <w:t>Duration</w:t>
+            </w:r>
+          </w:p>
+        </w:tc>
+        <w:tc>
+          <w:tcPr>
+            <w:tcW w:w="2691" w:type="dxa"/>
             <w:tcBorders>
               <w:top w:val="single" w:sz="4" w:space="0" w:color="000000"/>
               <w:left w:val="single" w:sz="4" w:space="0" w:color="000000"/>
@@ -955,6 +1306,7 @@
           <w:p>
             <w:pPr>
               <w:pStyle w:val="TableContents"/>
+              <w:widowControl w:val="false"/>
               <w:bidi w:val="0"/>
               <w:jc w:val="left"/>
               <w:rPr>
@@ -990,7 +1342,7 @@
                 <w:szCs w:val="24"/>
                 <w:u w:val="none"/>
               </w:rPr>
-              <w:t>1 x week</w:t>
+              <w:t>12h30</w:t>
             </w:r>
           </w:p>
         </w:tc>
@@ -1008,6 +1360,7 @@
           <w:p>
             <w:pPr>
               <w:pStyle w:val="TableContents"/>
+              <w:widowControl w:val="false"/>
               <w:bidi w:val="0"/>
               <w:jc w:val="left"/>
               <w:rPr>
@@ -1043,13 +1396,14 @@
                 <w:szCs w:val="24"/>
                 <w:u w:val="none"/>
               </w:rPr>
-              <w:t>Depends on</w:t>
+              <w:t>Prerequisites</w:t>
             </w:r>
           </w:p>
         </w:tc>
         <w:tc>
           <w:tcPr>
-            <w:tcW w:w="8050" w:type="dxa"/>
+            <w:tcW w:w="8057" w:type="dxa"/>
+            <w:gridSpan w:val="3"/>
             <w:tcBorders>
               <w:left w:val="single" w:sz="4" w:space="0" w:color="000000"/>
               <w:bottom w:val="single" w:sz="4" w:space="0" w:color="000000"/>
@@ -1059,42 +1413,196 @@
           <w:p>
             <w:pPr>
               <w:pStyle w:val="TableContents"/>
-              <w:bidi w:val="0"/>
-              <w:jc w:val="left"/>
-              <w:rPr>
-                <w:rFonts w:ascii="Liberation Serif" w:hAnsi="Liberation Serif"/>
-                <w:b w:val="false"/>
-                <w:b w:val="false"/>
-                <w:bCs w:val="false"/>
-                <w:i w:val="false"/>
-                <w:i w:val="false"/>
-                <w:iCs w:val="false"/>
-                <w:strike w:val="false"/>
-                <w:dstrike w:val="false"/>
-                <w:outline w:val="false"/>
-                <w:shadow w:val="false"/>
-                <w:color w:val="000000"/>
-                <w:sz w:val="24"/>
-                <w:szCs w:val="24"/>
-                <w:u w:val="none"/>
-              </w:rPr>
-            </w:pPr>
-            <w:r>
-              <w:rPr>
-                <w:b w:val="false"/>
-                <w:bCs w:val="false"/>
-                <w:i w:val="false"/>
-                <w:iCs w:val="false"/>
-                <w:strike w:val="false"/>
-                <w:dstrike w:val="false"/>
-                <w:outline w:val="false"/>
-                <w:shadow w:val="false"/>
-                <w:color w:val="000000"/>
-                <w:sz w:val="24"/>
-                <w:szCs w:val="24"/>
-                <w:u w:val="none"/>
-              </w:rPr>
-              <w:t>None</w:t>
+              <w:widowControl w:val="false"/>
+              <w:numPr>
+                <w:ilvl w:val="0"/>
+                <w:numId w:val="4"/>
+              </w:numPr>
+              <w:bidi w:val="0"/>
+              <w:jc w:val="left"/>
+              <w:rPr/>
+            </w:pPr>
+            <w:r>
+              <w:rPr>
+                <w:b w:val="false"/>
+                <w:bCs w:val="false"/>
+                <w:i w:val="false"/>
+                <w:iCs w:val="false"/>
+                <w:strike w:val="false"/>
+                <w:dstrike w:val="false"/>
+                <w:outline w:val="false"/>
+                <w:shadow w:val="false"/>
+                <w:color w:val="000000"/>
+                <w:sz w:val="24"/>
+                <w:szCs w:val="24"/>
+                <w:u w:val="none"/>
+              </w:rPr>
+              <w:t>Parameters to bet set in .env</w:t>
+            </w:r>
+            <w:r>
+              <w:rPr>
+                <w:b w:val="false"/>
+                <w:bCs w:val="false"/>
+                <w:i w:val="false"/>
+                <w:iCs w:val="false"/>
+                <w:strike w:val="false"/>
+                <w:dstrike w:val="false"/>
+                <w:outline w:val="false"/>
+                <w:shadow w:val="false"/>
+                <w:color w:val="000000"/>
+                <w:sz w:val="24"/>
+                <w:szCs w:val="24"/>
+                <w:u w:val="none"/>
+              </w:rPr>
+              <w:br/>
+              <w:t xml:space="preserve">PGBACKUP_PATH: </w:t>
+            </w:r>
+            <w:r>
+              <w:rPr>
+                <w:b w:val="false"/>
+                <w:bCs w:val="false"/>
+                <w:i/>
+                <w:iCs/>
+                <w:strike w:val="false"/>
+                <w:dstrike w:val="false"/>
+                <w:outline w:val="false"/>
+                <w:shadow w:val="false"/>
+                <w:color w:val="000000"/>
+                <w:sz w:val="24"/>
+                <w:szCs w:val="24"/>
+                <w:u w:val="none"/>
+              </w:rPr>
+              <w:t>Where the backup will be stored</w:t>
+            </w:r>
+            <w:r>
+              <w:rPr>
+                <w:b w:val="false"/>
+                <w:bCs w:val="false"/>
+                <w:i w:val="false"/>
+                <w:iCs w:val="false"/>
+                <w:strike w:val="false"/>
+                <w:dstrike w:val="false"/>
+                <w:outline w:val="false"/>
+                <w:shadow w:val="false"/>
+                <w:color w:val="000000"/>
+                <w:sz w:val="24"/>
+                <w:szCs w:val="24"/>
+                <w:u w:val="none"/>
+              </w:rPr>
+              <w:br/>
+              <w:t xml:space="preserve">BACKUP_CHUNK_SIZE: </w:t>
+            </w:r>
+            <w:r>
+              <w:rPr>
+                <w:b w:val="false"/>
+                <w:bCs w:val="false"/>
+                <w:i/>
+                <w:iCs/>
+                <w:strike w:val="false"/>
+                <w:dstrike w:val="false"/>
+                <w:outline w:val="false"/>
+                <w:shadow w:val="false"/>
+                <w:color w:val="000000"/>
+                <w:sz w:val="24"/>
+                <w:szCs w:val="24"/>
+                <w:u w:val="none"/>
+              </w:rPr>
+              <w:t>the size of each backup chunk</w:t>
+            </w:r>
+            <w:r>
+              <w:rPr>
+                <w:b w:val="false"/>
+                <w:bCs w:val="false"/>
+                <w:i w:val="false"/>
+                <w:iCs w:val="false"/>
+                <w:strike w:val="false"/>
+                <w:dstrike w:val="false"/>
+                <w:outline w:val="false"/>
+                <w:shadow w:val="false"/>
+                <w:color w:val="000000"/>
+                <w:sz w:val="24"/>
+                <w:szCs w:val="24"/>
+                <w:u w:val="none"/>
+              </w:rPr>
+              <w:br/>
+              <w:t xml:space="preserve">MAX_BACKUPS: </w:t>
+            </w:r>
+            <w:r>
+              <w:rPr>
+                <w:b w:val="false"/>
+                <w:bCs w:val="false"/>
+                <w:i/>
+                <w:iCs/>
+                <w:strike w:val="false"/>
+                <w:dstrike w:val="false"/>
+                <w:outline w:val="false"/>
+                <w:shadow w:val="false"/>
+                <w:color w:val="000000"/>
+                <w:sz w:val="24"/>
+                <w:szCs w:val="24"/>
+                <w:u w:val="none"/>
+              </w:rPr>
+              <w:t>How many backups will be kept after rotation</w:t>
+            </w:r>
+          </w:p>
+          <w:p>
+            <w:pPr>
+              <w:pStyle w:val="TableContents"/>
+              <w:widowControl w:val="false"/>
+              <w:numPr>
+                <w:ilvl w:val="0"/>
+                <w:numId w:val="4"/>
+              </w:numPr>
+              <w:bidi w:val="0"/>
+              <w:jc w:val="left"/>
+              <w:rPr/>
+            </w:pPr>
+            <w:r>
+              <w:rPr>
+                <w:b w:val="false"/>
+                <w:bCs w:val="false"/>
+                <w:i w:val="false"/>
+                <w:iCs w:val="false"/>
+                <w:strike w:val="false"/>
+                <w:dstrike w:val="false"/>
+                <w:outline w:val="false"/>
+                <w:shadow w:val="false"/>
+                <w:color w:val="000000"/>
+                <w:sz w:val="24"/>
+                <w:szCs w:val="24"/>
+                <w:u w:val="none"/>
+              </w:rPr>
+              <w:t>Make sure there is enough space in PGBACKUP_PATH (at least a TB).</w:t>
+            </w:r>
+          </w:p>
+          <w:p>
+            <w:pPr>
+              <w:pStyle w:val="TableContents"/>
+              <w:widowControl w:val="false"/>
+              <w:numPr>
+                <w:ilvl w:val="0"/>
+                <w:numId w:val="4"/>
+              </w:numPr>
+              <w:bidi w:val="0"/>
+              <w:jc w:val="left"/>
+              <w:rPr/>
+            </w:pPr>
+            <w:r>
+              <w:rPr>
+                <w:b w:val="false"/>
+                <w:bCs w:val="false"/>
+                <w:i w:val="false"/>
+                <w:iCs w:val="false"/>
+                <w:strike w:val="false"/>
+                <w:dstrike w:val="false"/>
+                <w:outline w:val="false"/>
+                <w:shadow w:val="false"/>
+                <w:color w:val="000000"/>
+                <w:sz w:val="24"/>
+                <w:szCs w:val="24"/>
+                <w:u w:val="none"/>
+              </w:rPr>
+              <w:t>Make sure BACKUP_CHUNK_SIZE is small enough that  each chunk will not exceed the recommended file size limit imposed by s3fs (about 100GB).</w:t>
             </w:r>
           </w:p>
         </w:tc>
@@ -1112,6 +1620,7 @@
           <w:p>
             <w:pPr>
               <w:pStyle w:val="TableContents"/>
+              <w:widowControl w:val="false"/>
               <w:bidi w:val="0"/>
               <w:jc w:val="left"/>
               <w:rPr>
@@ -1153,7 +1662,8 @@
         </w:tc>
         <w:tc>
           <w:tcPr>
-            <w:tcW w:w="8050" w:type="dxa"/>
+            <w:tcW w:w="8057" w:type="dxa"/>
+            <w:gridSpan w:val="3"/>
             <w:tcBorders>
               <w:left w:val="single" w:sz="4" w:space="0" w:color="000000"/>
               <w:bottom w:val="single" w:sz="4" w:space="0" w:color="000000"/>
@@ -1163,6 +1673,7 @@
           <w:p>
             <w:pPr>
               <w:pStyle w:val="TableContents"/>
+              <w:widowControl w:val="false"/>
               <w:numPr>
                 <w:ilvl w:val="0"/>
                 <w:numId w:val="3"/>
@@ -1208,6 +1719,7 @@
           <w:p>
             <w:pPr>
               <w:pStyle w:val="TableContents"/>
+              <w:widowControl w:val="false"/>
               <w:numPr>
                 <w:ilvl w:val="0"/>
                 <w:numId w:val="3"/>
@@ -1247,12 +1759,13 @@
                 <w:szCs w:val="24"/>
                 <w:u w:val="none"/>
               </w:rPr>
-              <w:t>Compress the backup, in tar.gz chunks of 10GB each</w:t>
-            </w:r>
-          </w:p>
-          <w:p>
-            <w:pPr>
-              <w:pStyle w:val="TableContents"/>
+              <w:t>Compress the backup, in tar.gz chunks of  BACKUP_CHUNK_SIZE each</w:t>
+            </w:r>
+          </w:p>
+          <w:p>
+            <w:pPr>
+              <w:pStyle w:val="TableContents"/>
+              <w:widowControl w:val="false"/>
               <w:numPr>
                 <w:ilvl w:val="0"/>
                 <w:numId w:val="3"/>
@@ -1298,6 +1811,7 @@
           <w:p>
             <w:pPr>
               <w:pStyle w:val="TableContents"/>
+              <w:widowControl w:val="false"/>
               <w:numPr>
                 <w:ilvl w:val="0"/>
                 <w:numId w:val="3"/>
@@ -1337,7 +1851,7 @@
                 <w:szCs w:val="24"/>
                 <w:u w:val="none"/>
               </w:rPr>
-              <w:t>Rotate old backups (keep only the last 3)</w:t>
+              <w:t>Rotate old backups (keep only the last MAX_BACKUPS)</w:t>
             </w:r>
           </w:p>
         </w:tc>
@@ -1355,6 +1869,7 @@
           <w:p>
             <w:pPr>
               <w:pStyle w:val="TableContents"/>
+              <w:widowControl w:val="false"/>
               <w:bidi w:val="0"/>
               <w:jc w:val="left"/>
               <w:rPr>
@@ -1396,7 +1911,8 @@
         </w:tc>
         <w:tc>
           <w:tcPr>
-            <w:tcW w:w="8050" w:type="dxa"/>
+            <w:tcW w:w="8057" w:type="dxa"/>
+            <w:gridSpan w:val="3"/>
             <w:tcBorders>
               <w:left w:val="single" w:sz="4" w:space="0" w:color="000000"/>
               <w:bottom w:val="single" w:sz="4" w:space="0" w:color="000000"/>
@@ -1406,6 +1922,7 @@
           <w:p>
             <w:pPr>
               <w:pStyle w:val="TableContents"/>
+              <w:widowControl w:val="false"/>
               <w:bidi w:val="0"/>
               <w:jc w:val="left"/>
               <w:rPr>
@@ -1441,7 +1958,41 @@
                 <w:szCs w:val="24"/>
                 <w:u w:val="none"/>
               </w:rPr>
-              <w:t>The compressed backup consists of a directory with many tar.gz chunks of 10GB each. Theses can be downloaded to a safe place (Z).</w:t>
+              <w:t xml:space="preserve">The compressed backup consists of a directory </w:t>
+            </w:r>
+            <w:r>
+              <w:rPr>
+                <w:b w:val="false"/>
+                <w:bCs w:val="false"/>
+                <w:i w:val="false"/>
+                <w:iCs w:val="false"/>
+                <w:strike w:val="false"/>
+                <w:dstrike w:val="false"/>
+                <w:outline w:val="false"/>
+                <w:shadow w:val="false"/>
+                <w:color w:val="000000"/>
+                <w:sz w:val="24"/>
+                <w:szCs w:val="24"/>
+                <w:u w:val="none"/>
+              </w:rPr>
+              <w:t>in PGBACKUP_PATH</w:t>
+            </w:r>
+            <w:r>
+              <w:rPr>
+                <w:b w:val="false"/>
+                <w:bCs w:val="false"/>
+                <w:i w:val="false"/>
+                <w:iCs w:val="false"/>
+                <w:strike w:val="false"/>
+                <w:dstrike w:val="false"/>
+                <w:outline w:val="false"/>
+                <w:shadow w:val="false"/>
+                <w:color w:val="000000"/>
+                <w:sz w:val="24"/>
+                <w:szCs w:val="24"/>
+                <w:u w:val="none"/>
+              </w:rPr>
+              <w:t xml:space="preserve"> with many tar.gz chunks of BACKUP_CHUNK_SIZE each. Theses can be downloaded to a safe place (Z).</w:t>
             </w:r>
           </w:p>
         </w:tc>
@@ -1472,6 +2023,10 @@
     <w:p>
       <w:pPr>
         <w:pStyle w:val="Heading3"/>
+        <w:numPr>
+          <w:ilvl w:val="2"/>
+          <w:numId w:val="1"/>
+        </w:numPr>
         <w:bidi w:val="0"/>
         <w:jc w:val="left"/>
         <w:rPr/>
@@ -1496,7 +2051,7 @@
       </w:tblPr>
       <w:tblGrid>
         <w:gridCol w:w="1588"/>
-        <w:gridCol w:w="8050"/>
+        <w:gridCol w:w="8049"/>
       </w:tblGrid>
       <w:tr>
         <w:trPr/>
@@ -1512,6 +2067,7 @@
           <w:p>
             <w:pPr>
               <w:pStyle w:val="TableContents"/>
+              <w:widowControl w:val="false"/>
               <w:bidi w:val="0"/>
               <w:jc w:val="left"/>
               <w:rPr>
@@ -1553,7 +2109,7 @@
         </w:tc>
         <w:tc>
           <w:tcPr>
-            <w:tcW w:w="8050" w:type="dxa"/>
+            <w:tcW w:w="8049" w:type="dxa"/>
             <w:tcBorders>
               <w:top w:val="single" w:sz="4" w:space="0" w:color="000000"/>
               <w:left w:val="single" w:sz="4" w:space="0" w:color="000000"/>
@@ -1564,6 +2120,7 @@
           <w:p>
             <w:pPr>
               <w:pStyle w:val="TableContents"/>
+              <w:widowControl w:val="false"/>
               <w:bidi w:val="0"/>
               <w:jc w:val="left"/>
               <w:rPr>
@@ -1616,6 +2173,7 @@
           <w:p>
             <w:pPr>
               <w:pStyle w:val="TableContents"/>
+              <w:widowControl w:val="false"/>
               <w:bidi w:val="0"/>
               <w:jc w:val="left"/>
               <w:rPr>
@@ -1657,7 +2215,7 @@
         </w:tc>
         <w:tc>
           <w:tcPr>
-            <w:tcW w:w="8050" w:type="dxa"/>
+            <w:tcW w:w="8049" w:type="dxa"/>
             <w:tcBorders>
               <w:left w:val="single" w:sz="4" w:space="0" w:color="000000"/>
               <w:bottom w:val="single" w:sz="4" w:space="0" w:color="000000"/>
@@ -1667,6 +2225,7 @@
           <w:p>
             <w:pPr>
               <w:pStyle w:val="TableContents"/>
+              <w:widowControl w:val="false"/>
               <w:bidi w:val="0"/>
               <w:jc w:val="left"/>
               <w:rPr>
@@ -1719,6 +2278,7 @@
           <w:p>
             <w:pPr>
               <w:pStyle w:val="TableContents"/>
+              <w:widowControl w:val="false"/>
               <w:bidi w:val="0"/>
               <w:jc w:val="left"/>
               <w:rPr>
@@ -1760,7 +2320,7 @@
         </w:tc>
         <w:tc>
           <w:tcPr>
-            <w:tcW w:w="8050" w:type="dxa"/>
+            <w:tcW w:w="8049" w:type="dxa"/>
             <w:tcBorders>
               <w:left w:val="single" w:sz="4" w:space="0" w:color="000000"/>
               <w:bottom w:val="single" w:sz="4" w:space="0" w:color="000000"/>
@@ -1770,6 +2330,7 @@
           <w:p>
             <w:pPr>
               <w:pStyle w:val="TableContents"/>
+              <w:widowControl w:val="false"/>
               <w:bidi w:val="0"/>
               <w:jc w:val="left"/>
               <w:rPr>
@@ -1822,6 +2383,7 @@
           <w:p>
             <w:pPr>
               <w:pStyle w:val="TableContents"/>
+              <w:widowControl w:val="false"/>
               <w:bidi w:val="0"/>
               <w:jc w:val="left"/>
               <w:rPr>
@@ -1863,7 +2425,7 @@
         </w:tc>
         <w:tc>
           <w:tcPr>
-            <w:tcW w:w="8050" w:type="dxa"/>
+            <w:tcW w:w="8049" w:type="dxa"/>
             <w:tcBorders>
               <w:left w:val="single" w:sz="4" w:space="0" w:color="000000"/>
               <w:bottom w:val="single" w:sz="4" w:space="0" w:color="000000"/>
@@ -1873,6 +2435,7 @@
           <w:p>
             <w:pPr>
               <w:pStyle w:val="TableContents"/>
+              <w:widowControl w:val="false"/>
               <w:bidi w:val="0"/>
               <w:jc w:val="left"/>
               <w:rPr>
@@ -1931,6 +2494,7 @@
       <w:pgNumType w:fmt="decimal"/>
       <w:formProt w:val="false"/>
       <w:textDirection w:val="lrTb"/>
+      <w:docGrid w:type="default" w:linePitch="100" w:charSpace="0"/>
     </w:sectPr>
   </w:body>
 </w:document>
@@ -1941,7 +2505,6 @@
   <w:abstractNum w:abstractNumId="1">
     <w:lvl w:ilvl="0">
       <w:start w:val="1"/>
-      <w:pStyle w:val="Heading1"/>
       <w:numFmt w:val="none"/>
       <w:suff w:val="nothing"/>
       <w:lvlText w:val=""/>
@@ -1952,10 +2515,10 @@
         </w:tabs>
         <w:ind w:left="0" w:hanging="0"/>
       </w:pPr>
+      <w:rPr/>
     </w:lvl>
     <w:lvl w:ilvl="1">
       <w:start w:val="1"/>
-      <w:pStyle w:val="Heading2"/>
       <w:numFmt w:val="none"/>
       <w:suff w:val="nothing"/>
       <w:lvlText w:val=""/>
@@ -1966,10 +2529,10 @@
         </w:tabs>
         <w:ind w:left="0" w:hanging="0"/>
       </w:pPr>
+      <w:rPr/>
     </w:lvl>
     <w:lvl w:ilvl="2">
       <w:start w:val="1"/>
-      <w:pStyle w:val="Heading3"/>
       <w:numFmt w:val="none"/>
       <w:suff w:val="nothing"/>
       <w:lvlText w:val=""/>
@@ -1980,6 +2543,7 @@
         </w:tabs>
         <w:ind w:left="0" w:hanging="0"/>
       </w:pPr>
+      <w:rPr/>
     </w:lvl>
     <w:lvl w:ilvl="3">
       <w:start w:val="1"/>
@@ -1993,6 +2557,7 @@
         </w:tabs>
         <w:ind w:left="0" w:hanging="0"/>
       </w:pPr>
+      <w:rPr/>
     </w:lvl>
     <w:lvl w:ilvl="4">
       <w:start w:val="1"/>
@@ -2006,6 +2571,7 @@
         </w:tabs>
         <w:ind w:left="0" w:hanging="0"/>
       </w:pPr>
+      <w:rPr/>
     </w:lvl>
     <w:lvl w:ilvl="5">
       <w:start w:val="1"/>
@@ -2019,6 +2585,7 @@
         </w:tabs>
         <w:ind w:left="0" w:hanging="0"/>
       </w:pPr>
+      <w:rPr/>
     </w:lvl>
     <w:lvl w:ilvl="6">
       <w:start w:val="1"/>
@@ -2032,6 +2599,7 @@
         </w:tabs>
         <w:ind w:left="0" w:hanging="0"/>
       </w:pPr>
+      <w:rPr/>
     </w:lvl>
     <w:lvl w:ilvl="7">
       <w:start w:val="1"/>
@@ -2045,6 +2613,7 @@
         </w:tabs>
         <w:ind w:left="0" w:hanging="0"/>
       </w:pPr>
+      <w:rPr/>
     </w:lvl>
     <w:lvl w:ilvl="8">
       <w:start w:val="1"/>
@@ -2058,6 +2627,7 @@
         </w:tabs>
         <w:ind w:left="0" w:hanging="0"/>
       </w:pPr>
+      <w:rPr/>
     </w:lvl>
   </w:abstractNum>
   <w:abstractNum w:abstractNumId="2">
@@ -2296,6 +2866,399 @@
         <w:ind w:left="3600" w:hanging="360"/>
       </w:pPr>
       <w:rPr/>
+    </w:lvl>
+  </w:abstractNum>
+  <w:abstractNum w:abstractNumId="4">
+    <w:lvl w:ilvl="0">
+      <w:start w:val="1"/>
+      <w:numFmt w:val="bullet"/>
+      <w:lvlText w:val=""/>
+      <w:lvlJc w:val="left"/>
+      <w:pPr>
+        <w:tabs>
+          <w:tab w:val="num" w:pos="720"/>
+        </w:tabs>
+        <w:ind w:left="720" w:hanging="360"/>
+      </w:pPr>
+      <w:rPr>
+        <w:rFonts w:ascii="Symbol" w:hAnsi="Symbol" w:cs="Symbol" w:hint="default"/>
+      </w:rPr>
+    </w:lvl>
+    <w:lvl w:ilvl="1">
+      <w:start w:val="1"/>
+      <w:numFmt w:val="bullet"/>
+      <w:lvlText w:val="◦"/>
+      <w:lvlJc w:val="left"/>
+      <w:pPr>
+        <w:tabs>
+          <w:tab w:val="num" w:pos="1080"/>
+        </w:tabs>
+        <w:ind w:left="1080" w:hanging="360"/>
+      </w:pPr>
+      <w:rPr>
+        <w:rFonts w:ascii="OpenSymbol" w:hAnsi="OpenSymbol" w:cs="OpenSymbol" w:hint="default"/>
+      </w:rPr>
+    </w:lvl>
+    <w:lvl w:ilvl="2">
+      <w:start w:val="1"/>
+      <w:numFmt w:val="bullet"/>
+      <w:lvlText w:val="▪"/>
+      <w:lvlJc w:val="left"/>
+      <w:pPr>
+        <w:tabs>
+          <w:tab w:val="num" w:pos="1440"/>
+        </w:tabs>
+        <w:ind w:left="1440" w:hanging="360"/>
+      </w:pPr>
+      <w:rPr>
+        <w:rFonts w:ascii="OpenSymbol" w:hAnsi="OpenSymbol" w:cs="OpenSymbol" w:hint="default"/>
+      </w:rPr>
+    </w:lvl>
+    <w:lvl w:ilvl="3">
+      <w:start w:val="1"/>
+      <w:numFmt w:val="bullet"/>
+      <w:lvlText w:val=""/>
+      <w:lvlJc w:val="left"/>
+      <w:pPr>
+        <w:tabs>
+          <w:tab w:val="num" w:pos="1800"/>
+        </w:tabs>
+        <w:ind w:left="1800" w:hanging="360"/>
+      </w:pPr>
+      <w:rPr>
+        <w:rFonts w:ascii="Symbol" w:hAnsi="Symbol" w:cs="Symbol" w:hint="default"/>
+      </w:rPr>
+    </w:lvl>
+    <w:lvl w:ilvl="4">
+      <w:start w:val="1"/>
+      <w:numFmt w:val="bullet"/>
+      <w:lvlText w:val="◦"/>
+      <w:lvlJc w:val="left"/>
+      <w:pPr>
+        <w:tabs>
+          <w:tab w:val="num" w:pos="2160"/>
+        </w:tabs>
+        <w:ind w:left="2160" w:hanging="360"/>
+      </w:pPr>
+      <w:rPr>
+        <w:rFonts w:ascii="OpenSymbol" w:hAnsi="OpenSymbol" w:cs="OpenSymbol" w:hint="default"/>
+      </w:rPr>
+    </w:lvl>
+    <w:lvl w:ilvl="5">
+      <w:start w:val="1"/>
+      <w:numFmt w:val="bullet"/>
+      <w:lvlText w:val="▪"/>
+      <w:lvlJc w:val="left"/>
+      <w:pPr>
+        <w:tabs>
+          <w:tab w:val="num" w:pos="2520"/>
+        </w:tabs>
+        <w:ind w:left="2520" w:hanging="360"/>
+      </w:pPr>
+      <w:rPr>
+        <w:rFonts w:ascii="OpenSymbol" w:hAnsi="OpenSymbol" w:cs="OpenSymbol" w:hint="default"/>
+      </w:rPr>
+    </w:lvl>
+    <w:lvl w:ilvl="6">
+      <w:start w:val="1"/>
+      <w:numFmt w:val="bullet"/>
+      <w:lvlText w:val=""/>
+      <w:lvlJc w:val="left"/>
+      <w:pPr>
+        <w:tabs>
+          <w:tab w:val="num" w:pos="2880"/>
+        </w:tabs>
+        <w:ind w:left="2880" w:hanging="360"/>
+      </w:pPr>
+      <w:rPr>
+        <w:rFonts w:ascii="Symbol" w:hAnsi="Symbol" w:cs="Symbol" w:hint="default"/>
+      </w:rPr>
+    </w:lvl>
+    <w:lvl w:ilvl="7">
+      <w:start w:val="1"/>
+      <w:numFmt w:val="bullet"/>
+      <w:lvlText w:val="◦"/>
+      <w:lvlJc w:val="left"/>
+      <w:pPr>
+        <w:tabs>
+          <w:tab w:val="num" w:pos="3240"/>
+        </w:tabs>
+        <w:ind w:left="3240" w:hanging="360"/>
+      </w:pPr>
+      <w:rPr>
+        <w:rFonts w:ascii="OpenSymbol" w:hAnsi="OpenSymbol" w:cs="OpenSymbol" w:hint="default"/>
+      </w:rPr>
+    </w:lvl>
+    <w:lvl w:ilvl="8">
+      <w:start w:val="1"/>
+      <w:numFmt w:val="bullet"/>
+      <w:lvlText w:val="▪"/>
+      <w:lvlJc w:val="left"/>
+      <w:pPr>
+        <w:tabs>
+          <w:tab w:val="num" w:pos="3600"/>
+        </w:tabs>
+        <w:ind w:left="3600" w:hanging="360"/>
+      </w:pPr>
+      <w:rPr>
+        <w:rFonts w:ascii="OpenSymbol" w:hAnsi="OpenSymbol" w:cs="OpenSymbol" w:hint="default"/>
+      </w:rPr>
+    </w:lvl>
+  </w:abstractNum>
+  <w:abstractNum w:abstractNumId="5">
+    <w:lvl w:ilvl="0">
+      <w:start w:val="1"/>
+      <w:numFmt w:val="bullet"/>
+      <w:lvlText w:val=""/>
+      <w:lvlJc w:val="left"/>
+      <w:pPr>
+        <w:tabs>
+          <w:tab w:val="num" w:pos="720"/>
+        </w:tabs>
+        <w:ind w:left="720" w:hanging="360"/>
+      </w:pPr>
+      <w:rPr>
+        <w:rFonts w:ascii="Symbol" w:hAnsi="Symbol" w:cs="Symbol" w:hint="default"/>
+      </w:rPr>
+    </w:lvl>
+    <w:lvl w:ilvl="1">
+      <w:start w:val="1"/>
+      <w:numFmt w:val="bullet"/>
+      <w:lvlText w:val="◦"/>
+      <w:lvlJc w:val="left"/>
+      <w:pPr>
+        <w:tabs>
+          <w:tab w:val="num" w:pos="1080"/>
+        </w:tabs>
+        <w:ind w:left="1080" w:hanging="360"/>
+      </w:pPr>
+      <w:rPr>
+        <w:rFonts w:ascii="OpenSymbol" w:hAnsi="OpenSymbol" w:cs="OpenSymbol" w:hint="default"/>
+      </w:rPr>
+    </w:lvl>
+    <w:lvl w:ilvl="2">
+      <w:start w:val="1"/>
+      <w:numFmt w:val="bullet"/>
+      <w:lvlText w:val="▪"/>
+      <w:lvlJc w:val="left"/>
+      <w:pPr>
+        <w:tabs>
+          <w:tab w:val="num" w:pos="1440"/>
+        </w:tabs>
+        <w:ind w:left="1440" w:hanging="360"/>
+      </w:pPr>
+      <w:rPr>
+        <w:rFonts w:ascii="OpenSymbol" w:hAnsi="OpenSymbol" w:cs="OpenSymbol" w:hint="default"/>
+      </w:rPr>
+    </w:lvl>
+    <w:lvl w:ilvl="3">
+      <w:start w:val="1"/>
+      <w:numFmt w:val="bullet"/>
+      <w:lvlText w:val=""/>
+      <w:lvlJc w:val="left"/>
+      <w:pPr>
+        <w:tabs>
+          <w:tab w:val="num" w:pos="1800"/>
+        </w:tabs>
+        <w:ind w:left="1800" w:hanging="360"/>
+      </w:pPr>
+      <w:rPr>
+        <w:rFonts w:ascii="Symbol" w:hAnsi="Symbol" w:cs="Symbol" w:hint="default"/>
+      </w:rPr>
+    </w:lvl>
+    <w:lvl w:ilvl="4">
+      <w:start w:val="1"/>
+      <w:numFmt w:val="bullet"/>
+      <w:lvlText w:val="◦"/>
+      <w:lvlJc w:val="left"/>
+      <w:pPr>
+        <w:tabs>
+          <w:tab w:val="num" w:pos="2160"/>
+        </w:tabs>
+        <w:ind w:left="2160" w:hanging="360"/>
+      </w:pPr>
+      <w:rPr>
+        <w:rFonts w:ascii="OpenSymbol" w:hAnsi="OpenSymbol" w:cs="OpenSymbol" w:hint="default"/>
+      </w:rPr>
+    </w:lvl>
+    <w:lvl w:ilvl="5">
+      <w:start w:val="1"/>
+      <w:numFmt w:val="bullet"/>
+      <w:lvlText w:val="▪"/>
+      <w:lvlJc w:val="left"/>
+      <w:pPr>
+        <w:tabs>
+          <w:tab w:val="num" w:pos="2520"/>
+        </w:tabs>
+        <w:ind w:left="2520" w:hanging="360"/>
+      </w:pPr>
+      <w:rPr>
+        <w:rFonts w:ascii="OpenSymbol" w:hAnsi="OpenSymbol" w:cs="OpenSymbol" w:hint="default"/>
+      </w:rPr>
+    </w:lvl>
+    <w:lvl w:ilvl="6">
+      <w:start w:val="1"/>
+      <w:numFmt w:val="bullet"/>
+      <w:lvlText w:val=""/>
+      <w:lvlJc w:val="left"/>
+      <w:pPr>
+        <w:tabs>
+          <w:tab w:val="num" w:pos="2880"/>
+        </w:tabs>
+        <w:ind w:left="2880" w:hanging="360"/>
+      </w:pPr>
+      <w:rPr>
+        <w:rFonts w:ascii="Symbol" w:hAnsi="Symbol" w:cs="Symbol" w:hint="default"/>
+      </w:rPr>
+    </w:lvl>
+    <w:lvl w:ilvl="7">
+      <w:start w:val="1"/>
+      <w:numFmt w:val="bullet"/>
+      <w:lvlText w:val="◦"/>
+      <w:lvlJc w:val="left"/>
+      <w:pPr>
+        <w:tabs>
+          <w:tab w:val="num" w:pos="3240"/>
+        </w:tabs>
+        <w:ind w:left="3240" w:hanging="360"/>
+      </w:pPr>
+      <w:rPr>
+        <w:rFonts w:ascii="OpenSymbol" w:hAnsi="OpenSymbol" w:cs="OpenSymbol" w:hint="default"/>
+      </w:rPr>
+    </w:lvl>
+    <w:lvl w:ilvl="8">
+      <w:start w:val="1"/>
+      <w:numFmt w:val="bullet"/>
+      <w:lvlText w:val="▪"/>
+      <w:lvlJc w:val="left"/>
+      <w:pPr>
+        <w:tabs>
+          <w:tab w:val="num" w:pos="3600"/>
+        </w:tabs>
+        <w:ind w:left="3600" w:hanging="360"/>
+      </w:pPr>
+      <w:rPr>
+        <w:rFonts w:ascii="OpenSymbol" w:hAnsi="OpenSymbol" w:cs="OpenSymbol" w:hint="default"/>
+      </w:rPr>
+    </w:lvl>
+  </w:abstractNum>
+  <w:abstractNum w:abstractNumId="6">
+    <w:lvl w:ilvl="0">
+      <w:start w:val="1"/>
+      <w:numFmt w:val="none"/>
+      <w:suff w:val="nothing"/>
+      <w:lvlText w:val=""/>
+      <w:lvlJc w:val="left"/>
+      <w:pPr>
+        <w:tabs>
+          <w:tab w:val="num" w:pos="0"/>
+        </w:tabs>
+        <w:ind w:left="0" w:hanging="0"/>
+      </w:pPr>
+    </w:lvl>
+    <w:lvl w:ilvl="1">
+      <w:start w:val="1"/>
+      <w:numFmt w:val="none"/>
+      <w:suff w:val="nothing"/>
+      <w:lvlText w:val=""/>
+      <w:lvlJc w:val="left"/>
+      <w:pPr>
+        <w:tabs>
+          <w:tab w:val="num" w:pos="0"/>
+        </w:tabs>
+        <w:ind w:left="0" w:hanging="0"/>
+      </w:pPr>
+    </w:lvl>
+    <w:lvl w:ilvl="2">
+      <w:start w:val="1"/>
+      <w:numFmt w:val="none"/>
+      <w:suff w:val="nothing"/>
+      <w:lvlText w:val=""/>
+      <w:lvlJc w:val="left"/>
+      <w:pPr>
+        <w:tabs>
+          <w:tab w:val="num" w:pos="0"/>
+        </w:tabs>
+        <w:ind w:left="0" w:hanging="0"/>
+      </w:pPr>
+    </w:lvl>
+    <w:lvl w:ilvl="3">
+      <w:start w:val="1"/>
+      <w:numFmt w:val="none"/>
+      <w:suff w:val="nothing"/>
+      <w:lvlText w:val=""/>
+      <w:lvlJc w:val="left"/>
+      <w:pPr>
+        <w:tabs>
+          <w:tab w:val="num" w:pos="0"/>
+        </w:tabs>
+        <w:ind w:left="0" w:hanging="0"/>
+      </w:pPr>
+    </w:lvl>
+    <w:lvl w:ilvl="4">
+      <w:start w:val="1"/>
+      <w:numFmt w:val="none"/>
+      <w:suff w:val="nothing"/>
+      <w:lvlText w:val=""/>
+      <w:lvlJc w:val="left"/>
+      <w:pPr>
+        <w:tabs>
+          <w:tab w:val="num" w:pos="0"/>
+        </w:tabs>
+        <w:ind w:left="0" w:hanging="0"/>
+      </w:pPr>
+    </w:lvl>
+    <w:lvl w:ilvl="5">
+      <w:start w:val="1"/>
+      <w:numFmt w:val="none"/>
+      <w:suff w:val="nothing"/>
+      <w:lvlText w:val=""/>
+      <w:lvlJc w:val="left"/>
+      <w:pPr>
+        <w:tabs>
+          <w:tab w:val="num" w:pos="0"/>
+        </w:tabs>
+        <w:ind w:left="0" w:hanging="0"/>
+      </w:pPr>
+    </w:lvl>
+    <w:lvl w:ilvl="6">
+      <w:start w:val="1"/>
+      <w:numFmt w:val="none"/>
+      <w:suff w:val="nothing"/>
+      <w:lvlText w:val=""/>
+      <w:lvlJc w:val="left"/>
+      <w:pPr>
+        <w:tabs>
+          <w:tab w:val="num" w:pos="0"/>
+        </w:tabs>
+        <w:ind w:left="0" w:hanging="0"/>
+      </w:pPr>
+    </w:lvl>
+    <w:lvl w:ilvl="7">
+      <w:start w:val="1"/>
+      <w:numFmt w:val="none"/>
+      <w:suff w:val="nothing"/>
+      <w:lvlText w:val=""/>
+      <w:lvlJc w:val="left"/>
+      <w:pPr>
+        <w:tabs>
+          <w:tab w:val="num" w:pos="0"/>
+        </w:tabs>
+        <w:ind w:left="0" w:hanging="0"/>
+      </w:pPr>
+    </w:lvl>
+    <w:lvl w:ilvl="8">
+      <w:start w:val="1"/>
+      <w:numFmt w:val="none"/>
+      <w:suff w:val="nothing"/>
+      <w:lvlText w:val=""/>
+      <w:lvlJc w:val="left"/>
+      <w:pPr>
+        <w:tabs>
+          <w:tab w:val="num" w:pos="0"/>
+        </w:tabs>
+        <w:ind w:left="0" w:hanging="0"/>
+      </w:pPr>
     </w:lvl>
   </w:abstractNum>
   <w:num w:numId="1">
@@ -2306,6 +3269,15 @@
   </w:num>
   <w:num w:numId="3">
     <w:abstractNumId w:val="3"/>
+  </w:num>
+  <w:num w:numId="4">
+    <w:abstractNumId w:val="4"/>
+  </w:num>
+  <w:num w:numId="5">
+    <w:abstractNumId w:val="5"/>
+  </w:num>
+  <w:num w:numId="6">
+    <w:abstractNumId w:val="6"/>
   </w:num>
 </w:numbering>
 </file>
@@ -2324,7 +3296,6 @@
     </w:rPrDefault>
     <w:pPrDefault>
       <w:pPr>
-        <w:widowControl/>
         <w:suppressAutoHyphens w:val="true"/>
       </w:pPr>
     </w:pPrDefault>
@@ -2334,7 +3305,10 @@
     <w:qFormat/>
     <w:pPr>
       <w:widowControl/>
+      <w:suppressAutoHyphens w:val="true"/>
       <w:bidi w:val="0"/>
+      <w:spacing w:before="0" w:after="0"/>
+      <w:jc w:val="left"/>
     </w:pPr>
     <w:rPr>
       <w:rFonts w:ascii="Liberation Serif" w:hAnsi="Liberation Serif" w:eastAsia="DejaVu Sans" w:cs="DejaVu Sans"/>
@@ -2417,6 +3391,13 @@
     <w:qFormat/>
     <w:rPr/>
   </w:style>
+  <w:style w:type="character" w:styleId="Bullets">
+    <w:name w:val="Bullets"/>
+    <w:qFormat/>
+    <w:rPr>
+      <w:rFonts w:ascii="OpenSymbol" w:hAnsi="OpenSymbol" w:eastAsia="OpenSymbol" w:cs="OpenSymbol"/>
+    </w:rPr>
+  </w:style>
   <w:style w:type="paragraph" w:styleId="Heading">
     <w:name w:val="Heading"/>
     <w:basedOn w:val="Normal"/>

</xml_diff>

<commit_message>
Added new DAG to automate creation of max table
</commit_message>
<xml_diff>
--- a/docs/automation_concept.docx
+++ b/docs/automation_concept.docx
@@ -198,16 +198,16 @@
         </w:tblCellMar>
       </w:tblPr>
       <w:tblGrid>
-        <w:gridCol w:w="1588"/>
+        <w:gridCol w:w="1587"/>
         <w:gridCol w:w="3797"/>
-        <w:gridCol w:w="1569"/>
-        <w:gridCol w:w="2691"/>
+        <w:gridCol w:w="1570"/>
+        <w:gridCol w:w="2690"/>
       </w:tblGrid>
       <w:tr>
         <w:trPr/>
         <w:tc>
           <w:tcPr>
-            <w:tcW w:w="1588" w:type="dxa"/>
+            <w:tcW w:w="1587" w:type="dxa"/>
             <w:tcBorders>
               <w:top w:val="single" w:sz="4" w:space="0" w:color="000000"/>
               <w:left w:val="single" w:sz="4" w:space="0" w:color="000000"/>
@@ -305,30 +305,13 @@
                 <w:szCs w:val="24"/>
                 <w:u w:val="none"/>
               </w:rPr>
-              <w:t xml:space="preserve">1 </w:t>
-            </w:r>
-            <w:r>
-              <w:rPr>
-                <w:b w:val="false"/>
-                <w:bCs w:val="false"/>
-                <w:i w:val="false"/>
-                <w:iCs w:val="false"/>
-                <w:strike w:val="false"/>
-                <w:dstrike w:val="false"/>
-                <w:outline w:val="false"/>
-                <w:shadow w:val="false"/>
-                <w:color w:val="000000"/>
-                <w:sz w:val="24"/>
-                <w:szCs w:val="24"/>
-                <w:u w:val="none"/>
-              </w:rPr>
-              <w:t>x hour</w:t>
+              <w:t>1 x hour</w:t>
             </w:r>
           </w:p>
         </w:tc>
         <w:tc>
           <w:tcPr>
-            <w:tcW w:w="1569" w:type="dxa"/>
+            <w:tcW w:w="1570" w:type="dxa"/>
             <w:tcBorders>
               <w:top w:val="single" w:sz="4" w:space="0" w:color="000000"/>
               <w:left w:val="single" w:sz="4" w:space="0" w:color="000000"/>
@@ -380,7 +363,7 @@
         </w:tc>
         <w:tc>
           <w:tcPr>
-            <w:tcW w:w="2691" w:type="dxa"/>
+            <w:tcW w:w="2690" w:type="dxa"/>
             <w:tcBorders>
               <w:top w:val="single" w:sz="4" w:space="0" w:color="000000"/>
               <w:left w:val="single" w:sz="4" w:space="0" w:color="000000"/>
@@ -436,7 +419,7 @@
         <w:trPr/>
         <w:tc>
           <w:tcPr>
-            <w:tcW w:w="1588" w:type="dxa"/>
+            <w:tcW w:w="1587" w:type="dxa"/>
             <w:tcBorders>
               <w:left w:val="single" w:sz="4" w:space="0" w:color="000000"/>
               <w:bottom w:val="single" w:sz="4" w:space="0" w:color="000000"/>
@@ -538,24 +521,7 @@
                 <w:szCs w:val="24"/>
                 <w:u w:val="none"/>
               </w:rPr>
-              <w:t>P</w:t>
-            </w:r>
-            <w:r>
-              <w:rPr>
-                <w:b w:val="false"/>
-                <w:bCs w:val="false"/>
-                <w:i w:val="false"/>
-                <w:iCs w:val="false"/>
-                <w:strike w:val="false"/>
-                <w:dstrike w:val="false"/>
-                <w:outline w:val="false"/>
-                <w:shadow w:val="false"/>
-                <w:color w:val="000000"/>
-                <w:sz w:val="24"/>
-                <w:szCs w:val="24"/>
-                <w:u w:val="none"/>
-              </w:rPr>
-              <w:t>arameters to be set in .env</w:t>
+              <w:t>Parameters to be set in .env</w:t>
               <w:br/>
               <w:t>BASE_DATA_DIRECTORY:  T</w:t>
             </w:r>
@@ -629,7 +595,7 @@
         <w:trPr/>
         <w:tc>
           <w:tcPr>
-            <w:tcW w:w="1588" w:type="dxa"/>
+            <w:tcW w:w="1587" w:type="dxa"/>
             <w:tcBorders>
               <w:left w:val="single" w:sz="4" w:space="0" w:color="000000"/>
               <w:bottom w:val="single" w:sz="4" w:space="0" w:color="000000"/>
@@ -924,7 +890,7 @@
         <w:trPr/>
         <w:tc>
           <w:tcPr>
-            <w:tcW w:w="1588" w:type="dxa"/>
+            <w:tcW w:w="1587" w:type="dxa"/>
             <w:tcBorders>
               <w:left w:val="single" w:sz="4" w:space="0" w:color="000000"/>
               <w:bottom w:val="single" w:sz="4" w:space="0" w:color="000000"/>
@@ -1130,10 +1096,880 @@
         </w:tblCellMar>
       </w:tblPr>
       <w:tblGrid>
+        <w:gridCol w:w="1587"/>
+        <w:gridCol w:w="3797"/>
+        <w:gridCol w:w="1570"/>
+        <w:gridCol w:w="2690"/>
+      </w:tblGrid>
+      <w:tr>
+        <w:trPr/>
+        <w:tc>
+          <w:tcPr>
+            <w:tcW w:w="1587" w:type="dxa"/>
+            <w:tcBorders>
+              <w:top w:val="single" w:sz="4" w:space="0" w:color="000000"/>
+              <w:left w:val="single" w:sz="4" w:space="0" w:color="000000"/>
+              <w:bottom w:val="single" w:sz="4" w:space="0" w:color="000000"/>
+            </w:tcBorders>
+          </w:tcPr>
+          <w:p>
+            <w:pPr>
+              <w:pStyle w:val="TableContents"/>
+              <w:widowControl w:val="false"/>
+              <w:bidi w:val="0"/>
+              <w:jc w:val="left"/>
+              <w:rPr>
+                <w:rFonts w:ascii="Liberation Serif" w:hAnsi="Liberation Serif"/>
+                <w:b/>
+                <w:b/>
+                <w:bCs/>
+                <w:i w:val="false"/>
+                <w:i w:val="false"/>
+                <w:iCs w:val="false"/>
+                <w:strike w:val="false"/>
+                <w:dstrike w:val="false"/>
+                <w:outline w:val="false"/>
+                <w:shadow w:val="false"/>
+                <w:color w:val="000000"/>
+                <w:sz w:val="24"/>
+                <w:szCs w:val="24"/>
+                <w:u w:val="none"/>
+              </w:rPr>
+            </w:pPr>
+            <w:r>
+              <w:rPr>
+                <w:b/>
+                <w:bCs/>
+                <w:i w:val="false"/>
+                <w:iCs w:val="false"/>
+                <w:strike w:val="false"/>
+                <w:dstrike w:val="false"/>
+                <w:outline w:val="false"/>
+                <w:shadow w:val="false"/>
+                <w:color w:val="000000"/>
+                <w:sz w:val="24"/>
+                <w:szCs w:val="24"/>
+                <w:u w:val="none"/>
+              </w:rPr>
+              <w:t>Trigger</w:t>
+            </w:r>
+          </w:p>
+        </w:tc>
+        <w:tc>
+          <w:tcPr>
+            <w:tcW w:w="3797" w:type="dxa"/>
+            <w:tcBorders>
+              <w:top w:val="single" w:sz="4" w:space="0" w:color="000000"/>
+              <w:left w:val="single" w:sz="4" w:space="0" w:color="000000"/>
+              <w:bottom w:val="single" w:sz="4" w:space="0" w:color="000000"/>
+            </w:tcBorders>
+          </w:tcPr>
+          <w:p>
+            <w:pPr>
+              <w:pStyle w:val="TableContents"/>
+              <w:widowControl w:val="false"/>
+              <w:bidi w:val="0"/>
+              <w:jc w:val="left"/>
+              <w:rPr>
+                <w:rFonts w:ascii="Liberation Serif" w:hAnsi="Liberation Serif"/>
+                <w:b w:val="false"/>
+                <w:b w:val="false"/>
+                <w:bCs w:val="false"/>
+                <w:i w:val="false"/>
+                <w:i w:val="false"/>
+                <w:iCs w:val="false"/>
+                <w:strike w:val="false"/>
+                <w:dstrike w:val="false"/>
+                <w:outline w:val="false"/>
+                <w:shadow w:val="false"/>
+                <w:color w:val="000000"/>
+                <w:sz w:val="24"/>
+                <w:szCs w:val="24"/>
+                <w:u w:val="none"/>
+              </w:rPr>
+            </w:pPr>
+            <w:r>
+              <w:rPr>
+                <w:b w:val="false"/>
+                <w:bCs w:val="false"/>
+                <w:i w:val="false"/>
+                <w:iCs w:val="false"/>
+                <w:strike w:val="false"/>
+                <w:dstrike w:val="false"/>
+                <w:outline w:val="false"/>
+                <w:shadow w:val="false"/>
+                <w:color w:val="000000"/>
+                <w:sz w:val="24"/>
+                <w:szCs w:val="24"/>
+                <w:u w:val="none"/>
+              </w:rPr>
+              <w:t>1 x week</w:t>
+            </w:r>
+          </w:p>
+        </w:tc>
+        <w:tc>
+          <w:tcPr>
+            <w:tcW w:w="1570" w:type="dxa"/>
+            <w:tcBorders>
+              <w:top w:val="single" w:sz="4" w:space="0" w:color="000000"/>
+              <w:left w:val="single" w:sz="4" w:space="0" w:color="000000"/>
+              <w:bottom w:val="single" w:sz="4" w:space="0" w:color="000000"/>
+            </w:tcBorders>
+          </w:tcPr>
+          <w:p>
+            <w:pPr>
+              <w:pStyle w:val="TableContents"/>
+              <w:widowControl w:val="false"/>
+              <w:bidi w:val="0"/>
+              <w:jc w:val="left"/>
+              <w:rPr>
+                <w:rFonts w:ascii="Liberation Serif" w:hAnsi="Liberation Serif"/>
+                <w:b/>
+                <w:b/>
+                <w:bCs/>
+                <w:i w:val="false"/>
+                <w:i w:val="false"/>
+                <w:iCs w:val="false"/>
+                <w:strike w:val="false"/>
+                <w:dstrike w:val="false"/>
+                <w:outline w:val="false"/>
+                <w:shadow w:val="false"/>
+                <w:color w:val="000000"/>
+                <w:sz w:val="24"/>
+                <w:szCs w:val="24"/>
+                <w:u w:val="none"/>
+              </w:rPr>
+            </w:pPr>
+            <w:r>
+              <w:rPr>
+                <w:b/>
+                <w:bCs/>
+                <w:i w:val="false"/>
+                <w:iCs w:val="false"/>
+                <w:strike w:val="false"/>
+                <w:dstrike w:val="false"/>
+                <w:outline w:val="false"/>
+                <w:shadow w:val="false"/>
+                <w:color w:val="000000"/>
+                <w:sz w:val="24"/>
+                <w:szCs w:val="24"/>
+                <w:u w:val="none"/>
+              </w:rPr>
+              <w:t>Duration</w:t>
+            </w:r>
+          </w:p>
+        </w:tc>
+        <w:tc>
+          <w:tcPr>
+            <w:tcW w:w="2690" w:type="dxa"/>
+            <w:tcBorders>
+              <w:top w:val="single" w:sz="4" w:space="0" w:color="000000"/>
+              <w:left w:val="single" w:sz="4" w:space="0" w:color="000000"/>
+              <w:bottom w:val="single" w:sz="4" w:space="0" w:color="000000"/>
+              <w:right w:val="single" w:sz="4" w:space="0" w:color="000000"/>
+            </w:tcBorders>
+          </w:tcPr>
+          <w:p>
+            <w:pPr>
+              <w:pStyle w:val="TableContents"/>
+              <w:widowControl w:val="false"/>
+              <w:bidi w:val="0"/>
+              <w:jc w:val="left"/>
+              <w:rPr>
+                <w:rFonts w:ascii="Liberation Serif" w:hAnsi="Liberation Serif"/>
+                <w:b w:val="false"/>
+                <w:b w:val="false"/>
+                <w:bCs w:val="false"/>
+                <w:i w:val="false"/>
+                <w:i w:val="false"/>
+                <w:iCs w:val="false"/>
+                <w:strike w:val="false"/>
+                <w:dstrike w:val="false"/>
+                <w:outline w:val="false"/>
+                <w:shadow w:val="false"/>
+                <w:color w:val="000000"/>
+                <w:sz w:val="24"/>
+                <w:szCs w:val="24"/>
+                <w:u w:val="none"/>
+              </w:rPr>
+            </w:pPr>
+            <w:r>
+              <w:rPr>
+                <w:b w:val="false"/>
+                <w:bCs w:val="false"/>
+                <w:i w:val="false"/>
+                <w:iCs w:val="false"/>
+                <w:strike w:val="false"/>
+                <w:dstrike w:val="false"/>
+                <w:outline w:val="false"/>
+                <w:shadow w:val="false"/>
+                <w:color w:val="000000"/>
+                <w:sz w:val="24"/>
+                <w:szCs w:val="24"/>
+                <w:u w:val="none"/>
+              </w:rPr>
+              <w:t>12h30</w:t>
+            </w:r>
+          </w:p>
+        </w:tc>
+      </w:tr>
+      <w:tr>
+        <w:trPr/>
+        <w:tc>
+          <w:tcPr>
+            <w:tcW w:w="1587" w:type="dxa"/>
+            <w:tcBorders>
+              <w:left w:val="single" w:sz="4" w:space="0" w:color="000000"/>
+              <w:bottom w:val="single" w:sz="4" w:space="0" w:color="000000"/>
+            </w:tcBorders>
+          </w:tcPr>
+          <w:p>
+            <w:pPr>
+              <w:pStyle w:val="TableContents"/>
+              <w:widowControl w:val="false"/>
+              <w:bidi w:val="0"/>
+              <w:jc w:val="left"/>
+              <w:rPr>
+                <w:rFonts w:ascii="Liberation Serif" w:hAnsi="Liberation Serif"/>
+                <w:b/>
+                <w:b/>
+                <w:bCs/>
+                <w:i w:val="false"/>
+                <w:i w:val="false"/>
+                <w:iCs w:val="false"/>
+                <w:strike w:val="false"/>
+                <w:dstrike w:val="false"/>
+                <w:outline w:val="false"/>
+                <w:shadow w:val="false"/>
+                <w:color w:val="000000"/>
+                <w:sz w:val="24"/>
+                <w:szCs w:val="24"/>
+                <w:u w:val="none"/>
+              </w:rPr>
+            </w:pPr>
+            <w:r>
+              <w:rPr>
+                <w:b/>
+                <w:bCs/>
+                <w:i w:val="false"/>
+                <w:iCs w:val="false"/>
+                <w:strike w:val="false"/>
+                <w:dstrike w:val="false"/>
+                <w:outline w:val="false"/>
+                <w:shadow w:val="false"/>
+                <w:color w:val="000000"/>
+                <w:sz w:val="24"/>
+                <w:szCs w:val="24"/>
+                <w:u w:val="none"/>
+              </w:rPr>
+              <w:t>Depends on</w:t>
+            </w:r>
+          </w:p>
+        </w:tc>
+        <w:tc>
+          <w:tcPr>
+            <w:tcW w:w="8057" w:type="dxa"/>
+            <w:gridSpan w:val="3"/>
+            <w:tcBorders>
+              <w:left w:val="single" w:sz="4" w:space="0" w:color="000000"/>
+              <w:bottom w:val="single" w:sz="4" w:space="0" w:color="000000"/>
+              <w:right w:val="single" w:sz="4" w:space="0" w:color="000000"/>
+            </w:tcBorders>
+          </w:tcPr>
+          <w:p>
+            <w:pPr>
+              <w:pStyle w:val="TableContents"/>
+              <w:widowControl w:val="false"/>
+              <w:numPr>
+                <w:ilvl w:val="0"/>
+                <w:numId w:val="4"/>
+              </w:numPr>
+              <w:bidi w:val="0"/>
+              <w:jc w:val="left"/>
+              <w:rPr/>
+            </w:pPr>
+            <w:r>
+              <w:rPr>
+                <w:b w:val="false"/>
+                <w:bCs w:val="false"/>
+                <w:i w:val="false"/>
+                <w:iCs w:val="false"/>
+                <w:strike w:val="false"/>
+                <w:dstrike w:val="false"/>
+                <w:outline w:val="false"/>
+                <w:shadow w:val="false"/>
+                <w:color w:val="000000"/>
+                <w:sz w:val="24"/>
+                <w:szCs w:val="24"/>
+                <w:u w:val="none"/>
+              </w:rPr>
+              <w:t>Parameters to bet set in .env</w:t>
+              <w:br/>
+              <w:t xml:space="preserve">PGBACKUP_PATH: </w:t>
+            </w:r>
+            <w:r>
+              <w:rPr>
+                <w:b w:val="false"/>
+                <w:bCs w:val="false"/>
+                <w:i/>
+                <w:iCs/>
+                <w:strike w:val="false"/>
+                <w:dstrike w:val="false"/>
+                <w:outline w:val="false"/>
+                <w:shadow w:val="false"/>
+                <w:color w:val="000000"/>
+                <w:sz w:val="24"/>
+                <w:szCs w:val="24"/>
+                <w:u w:val="none"/>
+              </w:rPr>
+              <w:t>Where the backup will be stored</w:t>
+            </w:r>
+            <w:r>
+              <w:rPr>
+                <w:b w:val="false"/>
+                <w:bCs w:val="false"/>
+                <w:i w:val="false"/>
+                <w:iCs w:val="false"/>
+                <w:strike w:val="false"/>
+                <w:dstrike w:val="false"/>
+                <w:outline w:val="false"/>
+                <w:shadow w:val="false"/>
+                <w:color w:val="000000"/>
+                <w:sz w:val="24"/>
+                <w:szCs w:val="24"/>
+                <w:u w:val="none"/>
+              </w:rPr>
+              <w:br/>
+              <w:t xml:space="preserve">BACKUP_CHUNK_SIZE: </w:t>
+            </w:r>
+            <w:r>
+              <w:rPr>
+                <w:b w:val="false"/>
+                <w:bCs w:val="false"/>
+                <w:i/>
+                <w:iCs/>
+                <w:strike w:val="false"/>
+                <w:dstrike w:val="false"/>
+                <w:outline w:val="false"/>
+                <w:shadow w:val="false"/>
+                <w:color w:val="000000"/>
+                <w:sz w:val="24"/>
+                <w:szCs w:val="24"/>
+                <w:u w:val="none"/>
+              </w:rPr>
+              <w:t>the size of each backup chunk</w:t>
+            </w:r>
+            <w:r>
+              <w:rPr>
+                <w:b w:val="false"/>
+                <w:bCs w:val="false"/>
+                <w:i w:val="false"/>
+                <w:iCs w:val="false"/>
+                <w:strike w:val="false"/>
+                <w:dstrike w:val="false"/>
+                <w:outline w:val="false"/>
+                <w:shadow w:val="false"/>
+                <w:color w:val="000000"/>
+                <w:sz w:val="24"/>
+                <w:szCs w:val="24"/>
+                <w:u w:val="none"/>
+              </w:rPr>
+              <w:br/>
+              <w:t xml:space="preserve">MAX_BACKUPS: </w:t>
+            </w:r>
+            <w:r>
+              <w:rPr>
+                <w:b w:val="false"/>
+                <w:bCs w:val="false"/>
+                <w:i/>
+                <w:iCs/>
+                <w:strike w:val="false"/>
+                <w:dstrike w:val="false"/>
+                <w:outline w:val="false"/>
+                <w:shadow w:val="false"/>
+                <w:color w:val="000000"/>
+                <w:sz w:val="24"/>
+                <w:szCs w:val="24"/>
+                <w:u w:val="none"/>
+              </w:rPr>
+              <w:t>How many backups will be kept after rotation</w:t>
+            </w:r>
+          </w:p>
+          <w:p>
+            <w:pPr>
+              <w:pStyle w:val="TableContents"/>
+              <w:widowControl w:val="false"/>
+              <w:numPr>
+                <w:ilvl w:val="0"/>
+                <w:numId w:val="4"/>
+              </w:numPr>
+              <w:bidi w:val="0"/>
+              <w:jc w:val="left"/>
+              <w:rPr/>
+            </w:pPr>
+            <w:r>
+              <w:rPr>
+                <w:b w:val="false"/>
+                <w:bCs w:val="false"/>
+                <w:i w:val="false"/>
+                <w:iCs w:val="false"/>
+                <w:strike w:val="false"/>
+                <w:dstrike w:val="false"/>
+                <w:outline w:val="false"/>
+                <w:shadow w:val="false"/>
+                <w:color w:val="000000"/>
+                <w:sz w:val="24"/>
+                <w:szCs w:val="24"/>
+                <w:u w:val="none"/>
+              </w:rPr>
+              <w:t>Make sure there is enough space in PGBACKUP_PATH (at least a TB).</w:t>
+            </w:r>
+          </w:p>
+          <w:p>
+            <w:pPr>
+              <w:pStyle w:val="TableContents"/>
+              <w:widowControl w:val="false"/>
+              <w:numPr>
+                <w:ilvl w:val="0"/>
+                <w:numId w:val="4"/>
+              </w:numPr>
+              <w:bidi w:val="0"/>
+              <w:jc w:val="left"/>
+              <w:rPr/>
+            </w:pPr>
+            <w:r>
+              <w:rPr>
+                <w:b w:val="false"/>
+                <w:bCs w:val="false"/>
+                <w:i w:val="false"/>
+                <w:iCs w:val="false"/>
+                <w:strike w:val="false"/>
+                <w:dstrike w:val="false"/>
+                <w:outline w:val="false"/>
+                <w:shadow w:val="false"/>
+                <w:color w:val="000000"/>
+                <w:sz w:val="24"/>
+                <w:szCs w:val="24"/>
+                <w:u w:val="none"/>
+              </w:rPr>
+              <w:t>Make sure BACKUP_CHUNK_SIZE is small enough that  each chunk will not exceed the recommended file size limit imposed by s3fs (about 100GB).</w:t>
+            </w:r>
+          </w:p>
+        </w:tc>
+      </w:tr>
+      <w:tr>
+        <w:trPr/>
+        <w:tc>
+          <w:tcPr>
+            <w:tcW w:w="1587" w:type="dxa"/>
+            <w:tcBorders>
+              <w:left w:val="single" w:sz="4" w:space="0" w:color="000000"/>
+              <w:bottom w:val="single" w:sz="4" w:space="0" w:color="000000"/>
+            </w:tcBorders>
+          </w:tcPr>
+          <w:p>
+            <w:pPr>
+              <w:pStyle w:val="TableContents"/>
+              <w:widowControl w:val="false"/>
+              <w:bidi w:val="0"/>
+              <w:jc w:val="left"/>
+              <w:rPr>
+                <w:rFonts w:ascii="Liberation Serif" w:hAnsi="Liberation Serif"/>
+                <w:b/>
+                <w:b/>
+                <w:bCs/>
+                <w:i w:val="false"/>
+                <w:i w:val="false"/>
+                <w:iCs w:val="false"/>
+                <w:strike w:val="false"/>
+                <w:dstrike w:val="false"/>
+                <w:outline w:val="false"/>
+                <w:shadow w:val="false"/>
+                <w:color w:val="000000"/>
+                <w:sz w:val="24"/>
+                <w:szCs w:val="24"/>
+                <w:u w:val="none"/>
+              </w:rPr>
+            </w:pPr>
+            <w:r>
+              <w:rPr>
+                <w:b/>
+                <w:bCs/>
+                <w:i w:val="false"/>
+                <w:iCs w:val="false"/>
+                <w:strike w:val="false"/>
+                <w:dstrike w:val="false"/>
+                <w:outline w:val="false"/>
+                <w:shadow w:val="false"/>
+                <w:color w:val="000000"/>
+                <w:sz w:val="24"/>
+                <w:szCs w:val="24"/>
+                <w:u w:val="none"/>
+              </w:rPr>
+              <w:t>Tasks</w:t>
+            </w:r>
+          </w:p>
+        </w:tc>
+        <w:tc>
+          <w:tcPr>
+            <w:tcW w:w="8057" w:type="dxa"/>
+            <w:gridSpan w:val="3"/>
+            <w:tcBorders>
+              <w:left w:val="single" w:sz="4" w:space="0" w:color="000000"/>
+              <w:bottom w:val="single" w:sz="4" w:space="0" w:color="000000"/>
+              <w:right w:val="single" w:sz="4" w:space="0" w:color="000000"/>
+            </w:tcBorders>
+          </w:tcPr>
+          <w:p>
+            <w:pPr>
+              <w:pStyle w:val="TableContents"/>
+              <w:widowControl w:val="false"/>
+              <w:numPr>
+                <w:ilvl w:val="0"/>
+                <w:numId w:val="3"/>
+              </w:numPr>
+              <w:bidi w:val="0"/>
+              <w:jc w:val="left"/>
+              <w:rPr>
+                <w:rFonts w:ascii="Liberation Serif" w:hAnsi="Liberation Serif"/>
+                <w:b w:val="false"/>
+                <w:b w:val="false"/>
+                <w:bCs w:val="false"/>
+                <w:i w:val="false"/>
+                <w:i w:val="false"/>
+                <w:iCs w:val="false"/>
+                <w:strike w:val="false"/>
+                <w:dstrike w:val="false"/>
+                <w:outline w:val="false"/>
+                <w:shadow w:val="false"/>
+                <w:color w:val="000000"/>
+                <w:sz w:val="24"/>
+                <w:szCs w:val="24"/>
+                <w:u w:val="none"/>
+              </w:rPr>
+            </w:pPr>
+            <w:r>
+              <w:rPr>
+                <w:b w:val="false"/>
+                <w:bCs w:val="false"/>
+                <w:i w:val="false"/>
+                <w:iCs w:val="false"/>
+                <w:strike w:val="false"/>
+                <w:dstrike w:val="false"/>
+                <w:outline w:val="false"/>
+                <w:shadow w:val="false"/>
+                <w:color w:val="000000"/>
+                <w:sz w:val="24"/>
+                <w:szCs w:val="24"/>
+                <w:u w:val="none"/>
+              </w:rPr>
+              <w:t>Create a snapshot of the database, using the tool provided by Postgres</w:t>
+            </w:r>
+          </w:p>
+          <w:p>
+            <w:pPr>
+              <w:pStyle w:val="TableContents"/>
+              <w:widowControl w:val="false"/>
+              <w:numPr>
+                <w:ilvl w:val="0"/>
+                <w:numId w:val="3"/>
+              </w:numPr>
+              <w:bidi w:val="0"/>
+              <w:jc w:val="left"/>
+              <w:rPr>
+                <w:rFonts w:ascii="Liberation Serif" w:hAnsi="Liberation Serif"/>
+                <w:b w:val="false"/>
+                <w:b w:val="false"/>
+                <w:bCs w:val="false"/>
+                <w:i w:val="false"/>
+                <w:i w:val="false"/>
+                <w:iCs w:val="false"/>
+                <w:strike w:val="false"/>
+                <w:dstrike w:val="false"/>
+                <w:outline w:val="false"/>
+                <w:shadow w:val="false"/>
+                <w:color w:val="000000"/>
+                <w:sz w:val="24"/>
+                <w:szCs w:val="24"/>
+                <w:u w:val="none"/>
+              </w:rPr>
+            </w:pPr>
+            <w:r>
+              <w:rPr>
+                <w:b w:val="false"/>
+                <w:bCs w:val="false"/>
+                <w:i w:val="false"/>
+                <w:iCs w:val="false"/>
+                <w:strike w:val="false"/>
+                <w:dstrike w:val="false"/>
+                <w:outline w:val="false"/>
+                <w:shadow w:val="false"/>
+                <w:color w:val="000000"/>
+                <w:sz w:val="24"/>
+                <w:szCs w:val="24"/>
+                <w:u w:val="none"/>
+              </w:rPr>
+              <w:t>Compress the backup, in tar.gz chunks of  BACKUP_CHUNK_SIZE each</w:t>
+            </w:r>
+          </w:p>
+          <w:p>
+            <w:pPr>
+              <w:pStyle w:val="TableContents"/>
+              <w:widowControl w:val="false"/>
+              <w:numPr>
+                <w:ilvl w:val="0"/>
+                <w:numId w:val="3"/>
+              </w:numPr>
+              <w:bidi w:val="0"/>
+              <w:jc w:val="left"/>
+              <w:rPr>
+                <w:rFonts w:ascii="Liberation Serif" w:hAnsi="Liberation Serif"/>
+                <w:b w:val="false"/>
+                <w:b w:val="false"/>
+                <w:bCs w:val="false"/>
+                <w:i w:val="false"/>
+                <w:i w:val="false"/>
+                <w:iCs w:val="false"/>
+                <w:strike w:val="false"/>
+                <w:dstrike w:val="false"/>
+                <w:outline w:val="false"/>
+                <w:shadow w:val="false"/>
+                <w:color w:val="000000"/>
+                <w:sz w:val="24"/>
+                <w:szCs w:val="24"/>
+                <w:u w:val="none"/>
+              </w:rPr>
+            </w:pPr>
+            <w:r>
+              <w:rPr>
+                <w:b w:val="false"/>
+                <w:bCs w:val="false"/>
+                <w:i w:val="false"/>
+                <w:iCs w:val="false"/>
+                <w:strike w:val="false"/>
+                <w:dstrike w:val="false"/>
+                <w:outline w:val="false"/>
+                <w:shadow w:val="false"/>
+                <w:color w:val="000000"/>
+                <w:sz w:val="24"/>
+                <w:szCs w:val="24"/>
+                <w:u w:val="none"/>
+              </w:rPr>
+              <w:t>Verify that the compressed files are OK</w:t>
+            </w:r>
+          </w:p>
+          <w:p>
+            <w:pPr>
+              <w:pStyle w:val="TableContents"/>
+              <w:widowControl w:val="false"/>
+              <w:numPr>
+                <w:ilvl w:val="0"/>
+                <w:numId w:val="3"/>
+              </w:numPr>
+              <w:bidi w:val="0"/>
+              <w:jc w:val="left"/>
+              <w:rPr>
+                <w:rFonts w:ascii="Liberation Serif" w:hAnsi="Liberation Serif"/>
+                <w:b w:val="false"/>
+                <w:b w:val="false"/>
+                <w:bCs w:val="false"/>
+                <w:i w:val="false"/>
+                <w:i w:val="false"/>
+                <w:iCs w:val="false"/>
+                <w:strike w:val="false"/>
+                <w:dstrike w:val="false"/>
+                <w:outline w:val="false"/>
+                <w:shadow w:val="false"/>
+                <w:color w:val="000000"/>
+                <w:sz w:val="24"/>
+                <w:szCs w:val="24"/>
+                <w:u w:val="none"/>
+              </w:rPr>
+            </w:pPr>
+            <w:r>
+              <w:rPr>
+                <w:b w:val="false"/>
+                <w:bCs w:val="false"/>
+                <w:i w:val="false"/>
+                <w:iCs w:val="false"/>
+                <w:strike w:val="false"/>
+                <w:dstrike w:val="false"/>
+                <w:outline w:val="false"/>
+                <w:shadow w:val="false"/>
+                <w:color w:val="000000"/>
+                <w:sz w:val="24"/>
+                <w:szCs w:val="24"/>
+                <w:u w:val="none"/>
+              </w:rPr>
+              <w:t>Rotate old backups (keep only the last MAX_BACKUPS)</w:t>
+            </w:r>
+          </w:p>
+        </w:tc>
+      </w:tr>
+      <w:tr>
+        <w:trPr/>
+        <w:tc>
+          <w:tcPr>
+            <w:tcW w:w="1587" w:type="dxa"/>
+            <w:tcBorders>
+              <w:left w:val="single" w:sz="4" w:space="0" w:color="000000"/>
+              <w:bottom w:val="single" w:sz="4" w:space="0" w:color="000000"/>
+            </w:tcBorders>
+          </w:tcPr>
+          <w:p>
+            <w:pPr>
+              <w:pStyle w:val="TableContents"/>
+              <w:widowControl w:val="false"/>
+              <w:bidi w:val="0"/>
+              <w:jc w:val="left"/>
+              <w:rPr>
+                <w:rFonts w:ascii="Liberation Serif" w:hAnsi="Liberation Serif"/>
+                <w:b/>
+                <w:b/>
+                <w:bCs/>
+                <w:i w:val="false"/>
+                <w:i w:val="false"/>
+                <w:iCs w:val="false"/>
+                <w:strike w:val="false"/>
+                <w:dstrike w:val="false"/>
+                <w:outline w:val="false"/>
+                <w:shadow w:val="false"/>
+                <w:color w:val="000000"/>
+                <w:sz w:val="24"/>
+                <w:szCs w:val="24"/>
+                <w:u w:val="none"/>
+              </w:rPr>
+            </w:pPr>
+            <w:r>
+              <w:rPr>
+                <w:b/>
+                <w:bCs/>
+                <w:i w:val="false"/>
+                <w:iCs w:val="false"/>
+                <w:strike w:val="false"/>
+                <w:dstrike w:val="false"/>
+                <w:outline w:val="false"/>
+                <w:shadow w:val="false"/>
+                <w:color w:val="000000"/>
+                <w:sz w:val="24"/>
+                <w:szCs w:val="24"/>
+                <w:u w:val="none"/>
+              </w:rPr>
+              <w:t>Result</w:t>
+            </w:r>
+          </w:p>
+        </w:tc>
+        <w:tc>
+          <w:tcPr>
+            <w:tcW w:w="8057" w:type="dxa"/>
+            <w:gridSpan w:val="3"/>
+            <w:tcBorders>
+              <w:left w:val="single" w:sz="4" w:space="0" w:color="000000"/>
+              <w:bottom w:val="single" w:sz="4" w:space="0" w:color="000000"/>
+              <w:right w:val="single" w:sz="4" w:space="0" w:color="000000"/>
+            </w:tcBorders>
+          </w:tcPr>
+          <w:p>
+            <w:pPr>
+              <w:pStyle w:val="TableContents"/>
+              <w:widowControl w:val="false"/>
+              <w:bidi w:val="0"/>
+              <w:jc w:val="left"/>
+              <w:rPr>
+                <w:rFonts w:ascii="Liberation Serif" w:hAnsi="Liberation Serif"/>
+                <w:b w:val="false"/>
+                <w:b w:val="false"/>
+                <w:bCs w:val="false"/>
+                <w:i w:val="false"/>
+                <w:i w:val="false"/>
+                <w:iCs w:val="false"/>
+                <w:strike w:val="false"/>
+                <w:dstrike w:val="false"/>
+                <w:outline w:val="false"/>
+                <w:shadow w:val="false"/>
+                <w:color w:val="000000"/>
+                <w:sz w:val="24"/>
+                <w:szCs w:val="24"/>
+                <w:u w:val="none"/>
+              </w:rPr>
+            </w:pPr>
+            <w:r>
+              <w:rPr>
+                <w:b w:val="false"/>
+                <w:bCs w:val="false"/>
+                <w:i w:val="false"/>
+                <w:iCs w:val="false"/>
+                <w:strike w:val="false"/>
+                <w:dstrike w:val="false"/>
+                <w:outline w:val="false"/>
+                <w:shadow w:val="false"/>
+                <w:color w:val="000000"/>
+                <w:sz w:val="24"/>
+                <w:szCs w:val="24"/>
+                <w:u w:val="none"/>
+              </w:rPr>
+              <w:t>The compressed backup consists of a directory in PGBACKUP_PATH with many tar.gz chunks of BACKUP_CHUNK_SIZE each. Theses can be downloaded to a safe place (Z).</w:t>
+            </w:r>
+          </w:p>
+        </w:tc>
+      </w:tr>
+    </w:tbl>
+    <w:p>
+      <w:pPr>
+        <w:pStyle w:val="Normal"/>
+        <w:bidi w:val="0"/>
+        <w:jc w:val="left"/>
+        <w:rPr/>
+      </w:pPr>
+      <w:r>
+        <w:rPr/>
+      </w:r>
+    </w:p>
+    <w:p>
+      <w:pPr>
+        <w:pStyle w:val="Normal"/>
+        <w:bidi w:val="0"/>
+        <w:jc w:val="left"/>
+        <w:rPr/>
+      </w:pPr>
+      <w:r>
+        <w:rPr/>
+      </w:r>
+    </w:p>
+    <w:p>
+      <w:pPr>
+        <w:pStyle w:val="Heading3"/>
+        <w:numPr>
+          <w:ilvl w:val="2"/>
+          <w:numId w:val="1"/>
+        </w:numPr>
+        <w:bidi w:val="0"/>
+        <w:jc w:val="left"/>
+        <w:rPr/>
+      </w:pPr>
+      <w:r>
+        <w:rPr/>
+        <w:t>Populate max table</w:t>
+      </w:r>
+    </w:p>
+    <w:tbl>
+      <w:tblPr>
+        <w:tblW w:w="9645" w:type="dxa"/>
+        <w:jc w:val="left"/>
+        <w:tblInd w:w="-5" w:type="dxa"/>
+        <w:tblLayout w:type="fixed"/>
+        <w:tblCellMar>
+          <w:top w:w="55" w:type="dxa"/>
+          <w:left w:w="55" w:type="dxa"/>
+          <w:bottom w:w="55" w:type="dxa"/>
+          <w:right w:w="55" w:type="dxa"/>
+        </w:tblCellMar>
+      </w:tblPr>
+      <w:tblGrid>
         <w:gridCol w:w="1588"/>
         <w:gridCol w:w="3797"/>
-        <w:gridCol w:w="1569"/>
-        <w:gridCol w:w="2691"/>
+        <w:gridCol w:w="1530"/>
+        <w:gridCol w:w="2730"/>
       </w:tblGrid>
       <w:tr>
         <w:trPr/>
@@ -1237,13 +2073,13 @@
                 <w:szCs w:val="24"/>
                 <w:u w:val="none"/>
               </w:rPr>
-              <w:t>1 x week</w:t>
+              <w:t>1x day, Monday to Friday, at 4</w:t>
             </w:r>
           </w:p>
         </w:tc>
         <w:tc>
           <w:tcPr>
-            <w:tcW w:w="1569" w:type="dxa"/>
+            <w:tcW w:w="1530" w:type="dxa"/>
             <w:tcBorders>
               <w:top w:val="single" w:sz="4" w:space="0" w:color="000000"/>
               <w:left w:val="single" w:sz="4" w:space="0" w:color="000000"/>
@@ -1258,9 +2094,9 @@
               <w:jc w:val="left"/>
               <w:rPr>
                 <w:rFonts w:ascii="Liberation Serif" w:hAnsi="Liberation Serif"/>
-                <w:b/>
-                <w:b/>
-                <w:bCs/>
+                <w:b w:val="false"/>
+                <w:b w:val="false"/>
+                <w:bCs w:val="false"/>
                 <w:i w:val="false"/>
                 <w:i w:val="false"/>
                 <w:iCs w:val="false"/>
@@ -1295,7 +2131,7 @@
         </w:tc>
         <w:tc>
           <w:tcPr>
-            <w:tcW w:w="2691" w:type="dxa"/>
+            <w:tcW w:w="2730" w:type="dxa"/>
             <w:tcBorders>
               <w:top w:val="single" w:sz="4" w:space="0" w:color="000000"/>
               <w:left w:val="single" w:sz="4" w:space="0" w:color="000000"/>
@@ -1342,7 +2178,6 @@
                 <w:szCs w:val="24"/>
                 <w:u w:val="none"/>
               </w:rPr>
-              <w:t>12h30</w:t>
             </w:r>
           </w:p>
         </w:tc>
@@ -1396,7 +2231,7 @@
                 <w:szCs w:val="24"/>
                 <w:u w:val="none"/>
               </w:rPr>
-              <w:t>Prerequisites</w:t>
+              <w:t>Depends on</w:t>
             </w:r>
           </w:p>
         </w:tc>
@@ -1414,195 +2249,41 @@
             <w:pPr>
               <w:pStyle w:val="TableContents"/>
               <w:widowControl w:val="false"/>
-              <w:numPr>
-                <w:ilvl w:val="0"/>
-                <w:numId w:val="4"/>
-              </w:numPr>
-              <w:bidi w:val="0"/>
-              <w:jc w:val="left"/>
-              <w:rPr/>
-            </w:pPr>
-            <w:r>
-              <w:rPr>
-                <w:b w:val="false"/>
-                <w:bCs w:val="false"/>
-                <w:i w:val="false"/>
-                <w:iCs w:val="false"/>
-                <w:strike w:val="false"/>
-                <w:dstrike w:val="false"/>
-                <w:outline w:val="false"/>
-                <w:shadow w:val="false"/>
-                <w:color w:val="000000"/>
-                <w:sz w:val="24"/>
-                <w:szCs w:val="24"/>
-                <w:u w:val="none"/>
-              </w:rPr>
-              <w:t>Parameters to bet set in .env</w:t>
-            </w:r>
-            <w:r>
-              <w:rPr>
-                <w:b w:val="false"/>
-                <w:bCs w:val="false"/>
-                <w:i w:val="false"/>
-                <w:iCs w:val="false"/>
-                <w:strike w:val="false"/>
-                <w:dstrike w:val="false"/>
-                <w:outline w:val="false"/>
-                <w:shadow w:val="false"/>
-                <w:color w:val="000000"/>
-                <w:sz w:val="24"/>
-                <w:szCs w:val="24"/>
-                <w:u w:val="none"/>
-              </w:rPr>
-              <w:br/>
-              <w:t xml:space="preserve">PGBACKUP_PATH: </w:t>
-            </w:r>
-            <w:r>
-              <w:rPr>
-                <w:b w:val="false"/>
-                <w:bCs w:val="false"/>
-                <w:i/>
-                <w:iCs/>
-                <w:strike w:val="false"/>
-                <w:dstrike w:val="false"/>
-                <w:outline w:val="false"/>
-                <w:shadow w:val="false"/>
-                <w:color w:val="000000"/>
-                <w:sz w:val="24"/>
-                <w:szCs w:val="24"/>
-                <w:u w:val="none"/>
-              </w:rPr>
-              <w:t>Where the backup will be stored</w:t>
-            </w:r>
-            <w:r>
-              <w:rPr>
-                <w:b w:val="false"/>
-                <w:bCs w:val="false"/>
-                <w:i w:val="false"/>
-                <w:iCs w:val="false"/>
-                <w:strike w:val="false"/>
-                <w:dstrike w:val="false"/>
-                <w:outline w:val="false"/>
-                <w:shadow w:val="false"/>
-                <w:color w:val="000000"/>
-                <w:sz w:val="24"/>
-                <w:szCs w:val="24"/>
-                <w:u w:val="none"/>
-              </w:rPr>
-              <w:br/>
-              <w:t xml:space="preserve">BACKUP_CHUNK_SIZE: </w:t>
-            </w:r>
-            <w:r>
-              <w:rPr>
-                <w:b w:val="false"/>
-                <w:bCs w:val="false"/>
-                <w:i/>
-                <w:iCs/>
-                <w:strike w:val="false"/>
-                <w:dstrike w:val="false"/>
-                <w:outline w:val="false"/>
-                <w:shadow w:val="false"/>
-                <w:color w:val="000000"/>
-                <w:sz w:val="24"/>
-                <w:szCs w:val="24"/>
-                <w:u w:val="none"/>
-              </w:rPr>
-              <w:t>the size of each backup chunk</w:t>
-            </w:r>
-            <w:r>
-              <w:rPr>
-                <w:b w:val="false"/>
-                <w:bCs w:val="false"/>
-                <w:i w:val="false"/>
-                <w:iCs w:val="false"/>
-                <w:strike w:val="false"/>
-                <w:dstrike w:val="false"/>
-                <w:outline w:val="false"/>
-                <w:shadow w:val="false"/>
-                <w:color w:val="000000"/>
-                <w:sz w:val="24"/>
-                <w:szCs w:val="24"/>
-                <w:u w:val="none"/>
-              </w:rPr>
-              <w:br/>
-              <w:t xml:space="preserve">MAX_BACKUPS: </w:t>
-            </w:r>
-            <w:r>
-              <w:rPr>
-                <w:b w:val="false"/>
-                <w:bCs w:val="false"/>
-                <w:i/>
-                <w:iCs/>
-                <w:strike w:val="false"/>
-                <w:dstrike w:val="false"/>
-                <w:outline w:val="false"/>
-                <w:shadow w:val="false"/>
-                <w:color w:val="000000"/>
-                <w:sz w:val="24"/>
-                <w:szCs w:val="24"/>
-                <w:u w:val="none"/>
-              </w:rPr>
-              <w:t>How many backups will be kept after rotation</w:t>
-            </w:r>
-          </w:p>
-          <w:p>
-            <w:pPr>
-              <w:pStyle w:val="TableContents"/>
-              <w:widowControl w:val="false"/>
-              <w:numPr>
-                <w:ilvl w:val="0"/>
-                <w:numId w:val="4"/>
-              </w:numPr>
-              <w:bidi w:val="0"/>
-              <w:jc w:val="left"/>
-              <w:rPr/>
-            </w:pPr>
-            <w:r>
-              <w:rPr>
-                <w:b w:val="false"/>
-                <w:bCs w:val="false"/>
-                <w:i w:val="false"/>
-                <w:iCs w:val="false"/>
-                <w:strike w:val="false"/>
-                <w:dstrike w:val="false"/>
-                <w:outline w:val="false"/>
-                <w:shadow w:val="false"/>
-                <w:color w:val="000000"/>
-                <w:sz w:val="24"/>
-                <w:szCs w:val="24"/>
-                <w:u w:val="none"/>
-              </w:rPr>
-              <w:t>Make sure there is enough space in PGBACKUP_PATH (at least a TB).</w:t>
-            </w:r>
-          </w:p>
-          <w:p>
-            <w:pPr>
-              <w:pStyle w:val="TableContents"/>
-              <w:widowControl w:val="false"/>
-              <w:numPr>
-                <w:ilvl w:val="0"/>
-                <w:numId w:val="4"/>
-              </w:numPr>
-              <w:bidi w:val="0"/>
-              <w:jc w:val="left"/>
-              <w:rPr/>
-            </w:pPr>
-            <w:r>
-              <w:rPr>
-                <w:b w:val="false"/>
-                <w:bCs w:val="false"/>
-                <w:i w:val="false"/>
-                <w:iCs w:val="false"/>
-                <w:strike w:val="false"/>
-                <w:dstrike w:val="false"/>
-                <w:outline w:val="false"/>
-                <w:shadow w:val="false"/>
-                <w:color w:val="000000"/>
-                <w:sz w:val="24"/>
-                <w:szCs w:val="24"/>
-                <w:u w:val="none"/>
-              </w:rPr>
-              <w:t>Make sure BACKUP_CHUNK_SIZE is small enough that  each chunk will not exceed the recommended file size limit imposed by s3fs (about 100GB).</w:t>
+              <w:bidi w:val="0"/>
+              <w:jc w:val="left"/>
+              <w:rPr>
+                <w:rFonts w:ascii="Liberation Serif" w:hAnsi="Liberation Serif"/>
+                <w:b w:val="false"/>
+                <w:b w:val="false"/>
+                <w:bCs w:val="false"/>
+                <w:i w:val="false"/>
+                <w:i w:val="false"/>
+                <w:iCs w:val="false"/>
+                <w:strike w:val="false"/>
+                <w:dstrike w:val="false"/>
+                <w:outline w:val="false"/>
+                <w:shadow w:val="false"/>
+                <w:color w:val="000000"/>
+                <w:sz w:val="24"/>
+                <w:szCs w:val="24"/>
+                <w:u w:val="none"/>
+              </w:rPr>
+            </w:pPr>
+            <w:r>
+              <w:rPr>
+                <w:b w:val="false"/>
+                <w:bCs w:val="false"/>
+                <w:i w:val="false"/>
+                <w:iCs w:val="false"/>
+                <w:strike w:val="false"/>
+                <w:dstrike w:val="false"/>
+                <w:outline w:val="false"/>
+                <w:shadow w:val="false"/>
+                <w:color w:val="000000"/>
+                <w:sz w:val="24"/>
+                <w:szCs w:val="24"/>
+                <w:u w:val="none"/>
+              </w:rPr>
             </w:r>
           </w:p>
         </w:tc>
@@ -1676,7 +2357,7 @@
               <w:widowControl w:val="false"/>
               <w:numPr>
                 <w:ilvl w:val="0"/>
-                <w:numId w:val="3"/>
+                <w:numId w:val="6"/>
               </w:numPr>
               <w:bidi w:val="0"/>
               <w:jc w:val="left"/>
@@ -1713,7 +2394,7 @@
                 <w:szCs w:val="24"/>
                 <w:u w:val="none"/>
               </w:rPr>
-              <w:t>Create a snapshot of the database, using the tool provided by Postgres</w:t>
+              <w:t>Ensure the tables to store the data and the progress exist, and the required indexes</w:t>
             </w:r>
           </w:p>
           <w:p>
@@ -1722,7 +2403,7 @@
               <w:widowControl w:val="false"/>
               <w:numPr>
                 <w:ilvl w:val="0"/>
-                <w:numId w:val="3"/>
+                <w:numId w:val="6"/>
               </w:numPr>
               <w:bidi w:val="0"/>
               <w:jc w:val="left"/>
@@ -1759,7 +2440,7 @@
                 <w:szCs w:val="24"/>
                 <w:u w:val="none"/>
               </w:rPr>
-              <w:t>Compress the backup, in tar.gz chunks of  BACKUP_CHUNK_SIZE each</w:t>
+              <w:t>Process all partitions that have not been processed already, get the max confidence value for each combination of recording, model and label</w:t>
             </w:r>
           </w:p>
           <w:p>
@@ -1768,7 +2449,7 @@
               <w:widowControl w:val="false"/>
               <w:numPr>
                 <w:ilvl w:val="0"/>
-                <w:numId w:val="3"/>
+                <w:numId w:val="6"/>
               </w:numPr>
               <w:bidi w:val="0"/>
               <w:jc w:val="left"/>
@@ -1805,7 +2486,7 @@
                 <w:szCs w:val="24"/>
                 <w:u w:val="none"/>
               </w:rPr>
-              <w:t>Verify that the compressed files are OK</w:t>
+              <w:t xml:space="preserve">Summarize the result, log </w:t>
             </w:r>
           </w:p>
           <w:p>
@@ -1814,7 +2495,7 @@
               <w:widowControl w:val="false"/>
               <w:numPr>
                 <w:ilvl w:val="0"/>
-                <w:numId w:val="3"/>
+                <w:numId w:val="6"/>
               </w:numPr>
               <w:bidi w:val="0"/>
               <w:jc w:val="left"/>
@@ -1851,7 +2532,7 @@
                 <w:szCs w:val="24"/>
                 <w:u w:val="none"/>
               </w:rPr>
-              <w:t>Rotate old backups (keep only the last MAX_BACKUPS)</w:t>
+              <w:t>Merge new data into the old table</w:t>
             </w:r>
           </w:p>
         </w:tc>
@@ -1923,76 +2604,149 @@
             <w:pPr>
               <w:pStyle w:val="TableContents"/>
               <w:widowControl w:val="false"/>
-              <w:bidi w:val="0"/>
-              <w:jc w:val="left"/>
-              <w:rPr>
-                <w:rFonts w:ascii="Liberation Serif" w:hAnsi="Liberation Serif"/>
-                <w:b w:val="false"/>
-                <w:b w:val="false"/>
-                <w:bCs w:val="false"/>
-                <w:i w:val="false"/>
-                <w:i w:val="false"/>
-                <w:iCs w:val="false"/>
-                <w:strike w:val="false"/>
-                <w:dstrike w:val="false"/>
-                <w:outline w:val="false"/>
-                <w:shadow w:val="false"/>
-                <w:color w:val="000000"/>
-                <w:sz w:val="24"/>
-                <w:szCs w:val="24"/>
-                <w:u w:val="none"/>
-              </w:rPr>
-            </w:pPr>
-            <w:r>
-              <w:rPr>
-                <w:b w:val="false"/>
-                <w:bCs w:val="false"/>
-                <w:i w:val="false"/>
-                <w:iCs w:val="false"/>
-                <w:strike w:val="false"/>
-                <w:dstrike w:val="false"/>
-                <w:outline w:val="false"/>
-                <w:shadow w:val="false"/>
-                <w:color w:val="000000"/>
-                <w:sz w:val="24"/>
-                <w:szCs w:val="24"/>
-                <w:u w:val="none"/>
-              </w:rPr>
-              <w:t xml:space="preserve">The compressed backup consists of a directory </w:t>
-            </w:r>
-            <w:r>
-              <w:rPr>
-                <w:b w:val="false"/>
-                <w:bCs w:val="false"/>
-                <w:i w:val="false"/>
-                <w:iCs w:val="false"/>
-                <w:strike w:val="false"/>
-                <w:dstrike w:val="false"/>
-                <w:outline w:val="false"/>
-                <w:shadow w:val="false"/>
-                <w:color w:val="000000"/>
-                <w:sz w:val="24"/>
-                <w:szCs w:val="24"/>
-                <w:u w:val="none"/>
-              </w:rPr>
-              <w:t>in PGBACKUP_PATH</w:t>
-            </w:r>
-            <w:r>
-              <w:rPr>
-                <w:b w:val="false"/>
-                <w:bCs w:val="false"/>
-                <w:i w:val="false"/>
-                <w:iCs w:val="false"/>
-                <w:strike w:val="false"/>
-                <w:dstrike w:val="false"/>
-                <w:outline w:val="false"/>
-                <w:shadow w:val="false"/>
-                <w:color w:val="000000"/>
-                <w:sz w:val="24"/>
-                <w:szCs w:val="24"/>
-                <w:u w:val="none"/>
-              </w:rPr>
-              <w:t xml:space="preserve"> with many tar.gz chunks of BACKUP_CHUNK_SIZE each. Theses can be downloaded to a safe place (Z).</w:t>
+              <w:numPr>
+                <w:ilvl w:val="0"/>
+                <w:numId w:val="7"/>
+              </w:numPr>
+              <w:bidi w:val="0"/>
+              <w:jc w:val="left"/>
+              <w:rPr>
+                <w:rFonts w:ascii="Liberation Serif" w:hAnsi="Liberation Serif"/>
+                <w:b w:val="false"/>
+                <w:b w:val="false"/>
+                <w:bCs w:val="false"/>
+                <w:i w:val="false"/>
+                <w:i w:val="false"/>
+                <w:iCs w:val="false"/>
+                <w:strike w:val="false"/>
+                <w:dstrike w:val="false"/>
+                <w:outline w:val="false"/>
+                <w:shadow w:val="false"/>
+                <w:color w:val="000000"/>
+                <w:sz w:val="24"/>
+                <w:szCs w:val="24"/>
+                <w:u w:val="none"/>
+              </w:rPr>
+            </w:pPr>
+            <w:r>
+              <w:rPr>
+                <w:b w:val="false"/>
+                <w:bCs w:val="false"/>
+                <w:i w:val="false"/>
+                <w:iCs w:val="false"/>
+                <w:strike w:val="false"/>
+                <w:dstrike w:val="false"/>
+                <w:outline w:val="false"/>
+                <w:shadow w:val="false"/>
+                <w:color w:val="000000"/>
+                <w:sz w:val="24"/>
+                <w:szCs w:val="24"/>
+                <w:u w:val="none"/>
+              </w:rPr>
+              <w:t>The</w:t>
+            </w:r>
+            <w:r>
+              <w:rPr>
+                <w:b w:val="false"/>
+                <w:bCs w:val="false"/>
+                <w:i w:val="false"/>
+                <w:iCs w:val="false"/>
+                <w:strike w:val="false"/>
+                <w:dstrike w:val="false"/>
+                <w:outline w:val="false"/>
+                <w:shadow w:val="false"/>
+                <w:color w:val="auto"/>
+                <w:sz w:val="24"/>
+                <w:szCs w:val="24"/>
+                <w:u w:val="none"/>
+              </w:rPr>
+              <w:t xml:space="preserve"> </w:t>
+            </w:r>
+            <w:r>
+              <w:rPr>
+                <w:rFonts w:ascii="Droid Sans Mono;monospace;monospace" w:hAnsi="Droid Sans Mono;monospace;monospace"/>
+                <w:b w:val="false"/>
+                <w:bCs w:val="false"/>
+                <w:i w:val="false"/>
+                <w:iCs w:val="false"/>
+                <w:strike w:val="false"/>
+                <w:dstrike w:val="false"/>
+                <w:outline w:val="false"/>
+                <w:shadow w:val="false"/>
+                <w:color w:val="000000"/>
+                <w:sz w:val="21"/>
+                <w:szCs w:val="24"/>
+                <w:u w:val="none"/>
+                <w:shd w:fill="FFFFFF" w:val="clear"/>
+              </w:rPr>
+              <w:t>model_inference_results_max_confidence table contains the data required to generate the dashboard heatmaps.</w:t>
+            </w:r>
+          </w:p>
+          <w:p>
+            <w:pPr>
+              <w:pStyle w:val="TableContents"/>
+              <w:widowControl w:val="false"/>
+              <w:numPr>
+                <w:ilvl w:val="0"/>
+                <w:numId w:val="7"/>
+              </w:numPr>
+              <w:bidi w:val="0"/>
+              <w:jc w:val="left"/>
+              <w:rPr>
+                <w:rFonts w:ascii="Liberation Serif" w:hAnsi="Liberation Serif"/>
+                <w:b w:val="false"/>
+                <w:b w:val="false"/>
+                <w:bCs w:val="false"/>
+                <w:i w:val="false"/>
+                <w:i w:val="false"/>
+                <w:iCs w:val="false"/>
+                <w:strike w:val="false"/>
+                <w:dstrike w:val="false"/>
+                <w:outline w:val="false"/>
+                <w:shadow w:val="false"/>
+                <w:color w:val="000000"/>
+                <w:sz w:val="24"/>
+                <w:szCs w:val="24"/>
+                <w:u w:val="none"/>
+              </w:rPr>
+            </w:pPr>
+            <w:r>
+              <w:rPr>
+                <w:rFonts w:ascii="Droid Sans Mono;monospace;monospace" w:hAnsi="Droid Sans Mono;monospace;monospace"/>
+                <w:b w:val="false"/>
+                <w:bCs w:val="false"/>
+                <w:i w:val="false"/>
+                <w:iCs w:val="false"/>
+                <w:strike w:val="false"/>
+                <w:dstrike w:val="false"/>
+                <w:outline w:val="false"/>
+                <w:shadow w:val="false"/>
+                <w:color w:val="000000"/>
+                <w:sz w:val="21"/>
+                <w:szCs w:val="24"/>
+                <w:u w:val="none"/>
+                <w:shd w:fill="FFFFFF" w:val="clear"/>
+              </w:rPr>
+              <w:t>T</w:t>
+            </w:r>
+            <w:r>
+              <w:rPr>
+                <w:rFonts w:ascii="Droid Sans Mono;monospace;monospace" w:hAnsi="Droid Sans Mono;monospace;monospace"/>
+                <w:b w:val="false"/>
+                <w:bCs w:val="false"/>
+                <w:i w:val="false"/>
+                <w:iCs w:val="false"/>
+                <w:strike w:val="false"/>
+                <w:dstrike w:val="false"/>
+                <w:outline w:val="false"/>
+                <w:shadow w:val="false"/>
+                <w:color w:val="000000"/>
+                <w:sz w:val="21"/>
+                <w:szCs w:val="24"/>
+                <w:u w:val="none"/>
+                <w:shd w:fill="FFFFFF" w:val="clear"/>
+              </w:rPr>
+              <w:t>he migration_progress table contains information about the partitions that have already been processed</w:t>
             </w:r>
           </w:p>
         </w:tc>
@@ -3145,6 +3899,262 @@
   <w:abstractNum w:abstractNumId="6">
     <w:lvl w:ilvl="0">
       <w:start w:val="1"/>
+      <w:numFmt w:val="decimal"/>
+      <w:lvlText w:val="%1."/>
+      <w:lvlJc w:val="left"/>
+      <w:pPr>
+        <w:tabs>
+          <w:tab w:val="num" w:pos="720"/>
+        </w:tabs>
+        <w:ind w:left="720" w:hanging="360"/>
+      </w:pPr>
+      <w:rPr/>
+    </w:lvl>
+    <w:lvl w:ilvl="1">
+      <w:start w:val="1"/>
+      <w:numFmt w:val="decimal"/>
+      <w:lvlText w:val="%2."/>
+      <w:lvlJc w:val="left"/>
+      <w:pPr>
+        <w:tabs>
+          <w:tab w:val="num" w:pos="1080"/>
+        </w:tabs>
+        <w:ind w:left="1080" w:hanging="360"/>
+      </w:pPr>
+      <w:rPr/>
+    </w:lvl>
+    <w:lvl w:ilvl="2">
+      <w:start w:val="1"/>
+      <w:numFmt w:val="decimal"/>
+      <w:lvlText w:val="%3."/>
+      <w:lvlJc w:val="left"/>
+      <w:pPr>
+        <w:tabs>
+          <w:tab w:val="num" w:pos="1440"/>
+        </w:tabs>
+        <w:ind w:left="1440" w:hanging="360"/>
+      </w:pPr>
+      <w:rPr/>
+    </w:lvl>
+    <w:lvl w:ilvl="3">
+      <w:start w:val="1"/>
+      <w:numFmt w:val="decimal"/>
+      <w:lvlText w:val="%4."/>
+      <w:lvlJc w:val="left"/>
+      <w:pPr>
+        <w:tabs>
+          <w:tab w:val="num" w:pos="1800"/>
+        </w:tabs>
+        <w:ind w:left="1800" w:hanging="360"/>
+      </w:pPr>
+      <w:rPr/>
+    </w:lvl>
+    <w:lvl w:ilvl="4">
+      <w:start w:val="1"/>
+      <w:numFmt w:val="decimal"/>
+      <w:lvlText w:val="%5."/>
+      <w:lvlJc w:val="left"/>
+      <w:pPr>
+        <w:tabs>
+          <w:tab w:val="num" w:pos="2160"/>
+        </w:tabs>
+        <w:ind w:left="2160" w:hanging="360"/>
+      </w:pPr>
+      <w:rPr/>
+    </w:lvl>
+    <w:lvl w:ilvl="5">
+      <w:start w:val="1"/>
+      <w:numFmt w:val="decimal"/>
+      <w:lvlText w:val="%6."/>
+      <w:lvlJc w:val="left"/>
+      <w:pPr>
+        <w:tabs>
+          <w:tab w:val="num" w:pos="2520"/>
+        </w:tabs>
+        <w:ind w:left="2520" w:hanging="360"/>
+      </w:pPr>
+      <w:rPr/>
+    </w:lvl>
+    <w:lvl w:ilvl="6">
+      <w:start w:val="1"/>
+      <w:numFmt w:val="decimal"/>
+      <w:lvlText w:val="%7."/>
+      <w:lvlJc w:val="left"/>
+      <w:pPr>
+        <w:tabs>
+          <w:tab w:val="num" w:pos="2880"/>
+        </w:tabs>
+        <w:ind w:left="2880" w:hanging="360"/>
+      </w:pPr>
+      <w:rPr/>
+    </w:lvl>
+    <w:lvl w:ilvl="7">
+      <w:start w:val="1"/>
+      <w:numFmt w:val="decimal"/>
+      <w:lvlText w:val="%8."/>
+      <w:lvlJc w:val="left"/>
+      <w:pPr>
+        <w:tabs>
+          <w:tab w:val="num" w:pos="3240"/>
+        </w:tabs>
+        <w:ind w:left="3240" w:hanging="360"/>
+      </w:pPr>
+      <w:rPr/>
+    </w:lvl>
+    <w:lvl w:ilvl="8">
+      <w:start w:val="1"/>
+      <w:numFmt w:val="decimal"/>
+      <w:lvlText w:val="%9."/>
+      <w:lvlJc w:val="left"/>
+      <w:pPr>
+        <w:tabs>
+          <w:tab w:val="num" w:pos="3600"/>
+        </w:tabs>
+        <w:ind w:left="3600" w:hanging="360"/>
+      </w:pPr>
+      <w:rPr/>
+    </w:lvl>
+  </w:abstractNum>
+  <w:abstractNum w:abstractNumId="7">
+    <w:lvl w:ilvl="0">
+      <w:start w:val="1"/>
+      <w:numFmt w:val="bullet"/>
+      <w:lvlText w:val=""/>
+      <w:lvlJc w:val="left"/>
+      <w:pPr>
+        <w:tabs>
+          <w:tab w:val="num" w:pos="720"/>
+        </w:tabs>
+        <w:ind w:left="720" w:hanging="360"/>
+      </w:pPr>
+      <w:rPr>
+        <w:rFonts w:ascii="Symbol" w:hAnsi="Symbol" w:cs="Symbol" w:hint="default"/>
+      </w:rPr>
+    </w:lvl>
+    <w:lvl w:ilvl="1">
+      <w:start w:val="1"/>
+      <w:numFmt w:val="bullet"/>
+      <w:lvlText w:val="◦"/>
+      <w:lvlJc w:val="left"/>
+      <w:pPr>
+        <w:tabs>
+          <w:tab w:val="num" w:pos="1080"/>
+        </w:tabs>
+        <w:ind w:left="1080" w:hanging="360"/>
+      </w:pPr>
+      <w:rPr>
+        <w:rFonts w:ascii="OpenSymbol" w:hAnsi="OpenSymbol" w:cs="OpenSymbol" w:hint="default"/>
+      </w:rPr>
+    </w:lvl>
+    <w:lvl w:ilvl="2">
+      <w:start w:val="1"/>
+      <w:numFmt w:val="bullet"/>
+      <w:lvlText w:val="▪"/>
+      <w:lvlJc w:val="left"/>
+      <w:pPr>
+        <w:tabs>
+          <w:tab w:val="num" w:pos="1440"/>
+        </w:tabs>
+        <w:ind w:left="1440" w:hanging="360"/>
+      </w:pPr>
+      <w:rPr>
+        <w:rFonts w:ascii="OpenSymbol" w:hAnsi="OpenSymbol" w:cs="OpenSymbol" w:hint="default"/>
+      </w:rPr>
+    </w:lvl>
+    <w:lvl w:ilvl="3">
+      <w:start w:val="1"/>
+      <w:numFmt w:val="bullet"/>
+      <w:lvlText w:val=""/>
+      <w:lvlJc w:val="left"/>
+      <w:pPr>
+        <w:tabs>
+          <w:tab w:val="num" w:pos="1800"/>
+        </w:tabs>
+        <w:ind w:left="1800" w:hanging="360"/>
+      </w:pPr>
+      <w:rPr>
+        <w:rFonts w:ascii="Symbol" w:hAnsi="Symbol" w:cs="Symbol" w:hint="default"/>
+      </w:rPr>
+    </w:lvl>
+    <w:lvl w:ilvl="4">
+      <w:start w:val="1"/>
+      <w:numFmt w:val="bullet"/>
+      <w:lvlText w:val="◦"/>
+      <w:lvlJc w:val="left"/>
+      <w:pPr>
+        <w:tabs>
+          <w:tab w:val="num" w:pos="2160"/>
+        </w:tabs>
+        <w:ind w:left="2160" w:hanging="360"/>
+      </w:pPr>
+      <w:rPr>
+        <w:rFonts w:ascii="OpenSymbol" w:hAnsi="OpenSymbol" w:cs="OpenSymbol" w:hint="default"/>
+      </w:rPr>
+    </w:lvl>
+    <w:lvl w:ilvl="5">
+      <w:start w:val="1"/>
+      <w:numFmt w:val="bullet"/>
+      <w:lvlText w:val="▪"/>
+      <w:lvlJc w:val="left"/>
+      <w:pPr>
+        <w:tabs>
+          <w:tab w:val="num" w:pos="2520"/>
+        </w:tabs>
+        <w:ind w:left="2520" w:hanging="360"/>
+      </w:pPr>
+      <w:rPr>
+        <w:rFonts w:ascii="OpenSymbol" w:hAnsi="OpenSymbol" w:cs="OpenSymbol" w:hint="default"/>
+      </w:rPr>
+    </w:lvl>
+    <w:lvl w:ilvl="6">
+      <w:start w:val="1"/>
+      <w:numFmt w:val="bullet"/>
+      <w:lvlText w:val=""/>
+      <w:lvlJc w:val="left"/>
+      <w:pPr>
+        <w:tabs>
+          <w:tab w:val="num" w:pos="2880"/>
+        </w:tabs>
+        <w:ind w:left="2880" w:hanging="360"/>
+      </w:pPr>
+      <w:rPr>
+        <w:rFonts w:ascii="Symbol" w:hAnsi="Symbol" w:cs="Symbol" w:hint="default"/>
+      </w:rPr>
+    </w:lvl>
+    <w:lvl w:ilvl="7">
+      <w:start w:val="1"/>
+      <w:numFmt w:val="bullet"/>
+      <w:lvlText w:val="◦"/>
+      <w:lvlJc w:val="left"/>
+      <w:pPr>
+        <w:tabs>
+          <w:tab w:val="num" w:pos="3240"/>
+        </w:tabs>
+        <w:ind w:left="3240" w:hanging="360"/>
+      </w:pPr>
+      <w:rPr>
+        <w:rFonts w:ascii="OpenSymbol" w:hAnsi="OpenSymbol" w:cs="OpenSymbol" w:hint="default"/>
+      </w:rPr>
+    </w:lvl>
+    <w:lvl w:ilvl="8">
+      <w:start w:val="1"/>
+      <w:numFmt w:val="bullet"/>
+      <w:lvlText w:val="▪"/>
+      <w:lvlJc w:val="left"/>
+      <w:pPr>
+        <w:tabs>
+          <w:tab w:val="num" w:pos="3600"/>
+        </w:tabs>
+        <w:ind w:left="3600" w:hanging="360"/>
+      </w:pPr>
+      <w:rPr>
+        <w:rFonts w:ascii="OpenSymbol" w:hAnsi="OpenSymbol" w:cs="OpenSymbol" w:hint="default"/>
+      </w:rPr>
+    </w:lvl>
+  </w:abstractNum>
+  <w:abstractNum w:abstractNumId="8">
+    <w:lvl w:ilvl="0">
+      <w:start w:val="1"/>
       <w:numFmt w:val="none"/>
       <w:suff w:val="nothing"/>
       <w:lvlText w:val=""/>
@@ -3278,6 +4288,12 @@
   </w:num>
   <w:num w:numId="6">
     <w:abstractNumId w:val="6"/>
+  </w:num>
+  <w:num w:numId="7">
+    <w:abstractNumId w:val="7"/>
+  </w:num>
+  <w:num w:numId="8">
+    <w:abstractNumId w:val="8"/>
   </w:num>
 </w:numbering>
 </file>

</xml_diff>

<commit_message>
Run inferences overnight and scheduling #98
</commit_message>
<xml_diff>
--- a/docs/automation_concept.docx
+++ b/docs/automation_concept.docx
@@ -85,18 +85,16 @@
         <w:bidi w:val="0"/>
         <w:jc w:val="left"/>
         <w:rPr>
-          <w:rFonts w:ascii="Droid Sans Mono;monospace;monospace" w:hAnsi="Droid Sans Mono;monospace;monospace"/>
-          <w:b w:val="false"/>
-          <w:b w:val="false"/>
-          <w:color w:val="3B3B3B"/>
-          <w:sz w:val="21"/>
-          <w:shd w:fill="FFFFFF" w:val="clear"/>
+          <w:b/>
+          <w:b/>
+          <w:bCs/>
         </w:rPr>
       </w:pPr>
       <w:r>
         <w:rPr>
           <w:rFonts w:ascii="Droid Sans Mono;monospace;monospace" w:hAnsi="Droid Sans Mono;monospace;monospace"/>
-          <w:b w:val="false"/>
+          <w:b/>
+          <w:bCs/>
           <w:color w:val="3B3B3B"/>
           <w:sz w:val="21"/>
           <w:shd w:fill="FFFFFF" w:val="clear"/>
@@ -200,8 +198,8 @@
       <w:tblGrid>
         <w:gridCol w:w="1587"/>
         <w:gridCol w:w="3797"/>
-        <w:gridCol w:w="1570"/>
-        <w:gridCol w:w="2690"/>
+        <w:gridCol w:w="1571"/>
+        <w:gridCol w:w="2689"/>
       </w:tblGrid>
       <w:tr>
         <w:trPr/>
@@ -305,13 +303,30 @@
                 <w:szCs w:val="24"/>
                 <w:u w:val="none"/>
               </w:rPr>
-              <w:t>1 x hour</w:t>
+              <w:t xml:space="preserve">1 x </w:t>
+            </w:r>
+            <w:r>
+              <w:rPr>
+                <w:b w:val="false"/>
+                <w:bCs w:val="false"/>
+                <w:i w:val="false"/>
+                <w:iCs w:val="false"/>
+                <w:strike w:val="false"/>
+                <w:dstrike w:val="false"/>
+                <w:outline w:val="false"/>
+                <w:shadow w:val="false"/>
+                <w:color w:val="000000"/>
+                <w:sz w:val="24"/>
+                <w:szCs w:val="24"/>
+                <w:u w:val="none"/>
+              </w:rPr>
+              <w:t>day, weekdays at 4h</w:t>
             </w:r>
           </w:p>
         </w:tc>
         <w:tc>
           <w:tcPr>
-            <w:tcW w:w="1570" w:type="dxa"/>
+            <w:tcW w:w="1571" w:type="dxa"/>
             <w:tcBorders>
               <w:top w:val="single" w:sz="4" w:space="0" w:color="000000"/>
               <w:left w:val="single" w:sz="4" w:space="0" w:color="000000"/>
@@ -363,7 +378,7 @@
         </w:tc>
         <w:tc>
           <w:tcPr>
-            <w:tcW w:w="2690" w:type="dxa"/>
+            <w:tcW w:w="2689" w:type="dxa"/>
             <w:tcBorders>
               <w:top w:val="single" w:sz="4" w:space="0" w:color="000000"/>
               <w:left w:val="single" w:sz="4" w:space="0" w:color="000000"/>
@@ -1098,8 +1113,8 @@
       <w:tblGrid>
         <w:gridCol w:w="1587"/>
         <w:gridCol w:w="3797"/>
-        <w:gridCol w:w="1570"/>
-        <w:gridCol w:w="2690"/>
+        <w:gridCol w:w="1571"/>
+        <w:gridCol w:w="2689"/>
       </w:tblGrid>
       <w:tr>
         <w:trPr/>
@@ -1203,13 +1218,47 @@
                 <w:szCs w:val="24"/>
                 <w:u w:val="none"/>
               </w:rPr>
-              <w:t>1 x week</w:t>
+              <w:t>1 x week,</w:t>
+            </w:r>
+            <w:r>
+              <w:rPr>
+                <w:b w:val="false"/>
+                <w:bCs w:val="false"/>
+                <w:i w:val="false"/>
+                <w:iCs w:val="false"/>
+                <w:strike w:val="false"/>
+                <w:dstrike w:val="false"/>
+                <w:outline w:val="false"/>
+                <w:shadow w:val="false"/>
+                <w:color w:val="000000"/>
+                <w:sz w:val="24"/>
+                <w:szCs w:val="24"/>
+                <w:u w:val="none"/>
+              </w:rPr>
+              <w:t xml:space="preserve"> </w:t>
+            </w:r>
+            <w:r>
+              <w:rPr>
+                <w:b w:val="false"/>
+                <w:bCs w:val="false"/>
+                <w:i w:val="false"/>
+                <w:iCs w:val="false"/>
+                <w:strike w:val="false"/>
+                <w:dstrike w:val="false"/>
+                <w:outline w:val="false"/>
+                <w:shadow w:val="false"/>
+                <w:color w:val="000000"/>
+                <w:sz w:val="24"/>
+                <w:szCs w:val="24"/>
+                <w:u w:val="none"/>
+              </w:rPr>
+              <w:t>Friday at 21h</w:t>
             </w:r>
           </w:p>
         </w:tc>
         <w:tc>
           <w:tcPr>
-            <w:tcW w:w="1570" w:type="dxa"/>
+            <w:tcW w:w="1571" w:type="dxa"/>
             <w:tcBorders>
               <w:top w:val="single" w:sz="4" w:space="0" w:color="000000"/>
               <w:left w:val="single" w:sz="4" w:space="0" w:color="000000"/>
@@ -1261,7 +1310,7 @@
         </w:tc>
         <w:tc>
           <w:tcPr>
-            <w:tcW w:w="2690" w:type="dxa"/>
+            <w:tcW w:w="2689" w:type="dxa"/>
             <w:tcBorders>
               <w:top w:val="single" w:sz="4" w:space="0" w:color="000000"/>
               <w:left w:val="single" w:sz="4" w:space="0" w:color="000000"/>
@@ -1663,7 +1712,24 @@
                 <w:szCs w:val="24"/>
                 <w:u w:val="none"/>
               </w:rPr>
-              <w:t>Create a snapshot of the database, using the tool provided by Postgres</w:t>
+              <w:t xml:space="preserve"> </w:t>
+            </w:r>
+            <w:r>
+              <w:rPr>
+                <w:b w:val="false"/>
+                <w:bCs w:val="false"/>
+                <w:i w:val="false"/>
+                <w:iCs w:val="false"/>
+                <w:strike w:val="false"/>
+                <w:dstrike w:val="false"/>
+                <w:outline w:val="false"/>
+                <w:shadow w:val="false"/>
+                <w:color w:val="000000"/>
+                <w:sz w:val="24"/>
+                <w:szCs w:val="24"/>
+                <w:u w:val="none"/>
+              </w:rPr>
+              <w:t xml:space="preserve">Create Backup </w:t>
             </w:r>
           </w:p>
           <w:p>
@@ -1709,7 +1775,24 @@
                 <w:szCs w:val="24"/>
                 <w:u w:val="none"/>
               </w:rPr>
-              <w:t>Compress the backup, in tar.gz chunks of  BACKUP_CHUNK_SIZE each</w:t>
+              <w:t xml:space="preserve"> </w:t>
+            </w:r>
+            <w:r>
+              <w:rPr>
+                <w:b w:val="false"/>
+                <w:bCs w:val="false"/>
+                <w:i w:val="false"/>
+                <w:iCs w:val="false"/>
+                <w:strike w:val="false"/>
+                <w:dstrike w:val="false"/>
+                <w:outline w:val="false"/>
+                <w:shadow w:val="false"/>
+                <w:color w:val="000000"/>
+                <w:sz w:val="24"/>
+                <w:szCs w:val="24"/>
+                <w:u w:val="none"/>
+              </w:rPr>
+              <w:t>Compress Backup</w:t>
             </w:r>
           </w:p>
           <w:p>
@@ -1755,7 +1838,24 @@
                 <w:szCs w:val="24"/>
                 <w:u w:val="none"/>
               </w:rPr>
-              <w:t>Verify that the compressed files are OK</w:t>
+              <w:t xml:space="preserve"> </w:t>
+            </w:r>
+            <w:r>
+              <w:rPr>
+                <w:b w:val="false"/>
+                <w:bCs w:val="false"/>
+                <w:i w:val="false"/>
+                <w:iCs w:val="false"/>
+                <w:strike w:val="false"/>
+                <w:dstrike w:val="false"/>
+                <w:outline w:val="false"/>
+                <w:shadow w:val="false"/>
+                <w:color w:val="000000"/>
+                <w:sz w:val="24"/>
+                <w:szCs w:val="24"/>
+                <w:u w:val="none"/>
+              </w:rPr>
+              <w:t>Verify Backup</w:t>
             </w:r>
           </w:p>
           <w:p>
@@ -1801,7 +1901,24 @@
                 <w:szCs w:val="24"/>
                 <w:u w:val="none"/>
               </w:rPr>
-              <w:t>Rotate old backups (keep only the last MAX_BACKUPS)</w:t>
+              <w:t xml:space="preserve"> </w:t>
+            </w:r>
+            <w:r>
+              <w:rPr>
+                <w:b w:val="false"/>
+                <w:bCs w:val="false"/>
+                <w:i w:val="false"/>
+                <w:iCs w:val="false"/>
+                <w:strike w:val="false"/>
+                <w:dstrike w:val="false"/>
+                <w:outline w:val="false"/>
+                <w:shadow w:val="false"/>
+                <w:color w:val="000000"/>
+                <w:sz w:val="24"/>
+                <w:szCs w:val="24"/>
+                <w:u w:val="none"/>
+              </w:rPr>
+              <w:t>Rotate Backups</w:t>
             </w:r>
           </w:p>
         </w:tc>
@@ -1909,6 +2026,48 @@
                 <w:u w:val="none"/>
               </w:rPr>
               <w:t>The compressed backup consists of a directory in PGBACKUP_PATH with many tar.gz chunks of BACKUP_CHUNK_SIZE each. Theses can be downloaded to a safe place (Z).</w:t>
+            </w:r>
+          </w:p>
+          <w:p>
+            <w:pPr>
+              <w:pStyle w:val="TableContents"/>
+              <w:widowControl w:val="false"/>
+              <w:bidi w:val="0"/>
+              <w:jc w:val="left"/>
+              <w:rPr>
+                <w:rFonts w:ascii="Liberation Serif" w:hAnsi="Liberation Serif"/>
+                <w:b w:val="false"/>
+                <w:b w:val="false"/>
+                <w:bCs w:val="false"/>
+                <w:i w:val="false"/>
+                <w:i w:val="false"/>
+                <w:iCs w:val="false"/>
+                <w:strike w:val="false"/>
+                <w:dstrike w:val="false"/>
+                <w:outline w:val="false"/>
+                <w:shadow w:val="false"/>
+                <w:color w:val="000000"/>
+                <w:sz w:val="24"/>
+                <w:szCs w:val="24"/>
+                <w:u w:val="none"/>
+              </w:rPr>
+            </w:pPr>
+            <w:r>
+              <w:rPr>
+                <w:b w:val="false"/>
+                <w:bCs w:val="false"/>
+                <w:i w:val="false"/>
+                <w:iCs w:val="false"/>
+                <w:strike w:val="false"/>
+                <w:dstrike w:val="false"/>
+                <w:outline w:val="false"/>
+                <w:shadow w:val="false"/>
+                <w:color w:val="000000"/>
+                <w:sz w:val="24"/>
+                <w:szCs w:val="24"/>
+                <w:u w:val="none"/>
+              </w:rPr>
+              <w:t>Alse see: docs/backup_restoration.txt</w:t>
             </w:r>
           </w:p>
         </w:tc>
@@ -1966,16 +2125,16 @@
         </w:tblCellMar>
       </w:tblPr>
       <w:tblGrid>
-        <w:gridCol w:w="1588"/>
+        <w:gridCol w:w="1587"/>
         <w:gridCol w:w="3797"/>
-        <w:gridCol w:w="1530"/>
-        <w:gridCol w:w="2730"/>
+        <w:gridCol w:w="1531"/>
+        <w:gridCol w:w="2729"/>
       </w:tblGrid>
       <w:tr>
         <w:trPr/>
         <w:tc>
           <w:tcPr>
-            <w:tcW w:w="1588" w:type="dxa"/>
+            <w:tcW w:w="1587" w:type="dxa"/>
             <w:tcBorders>
               <w:top w:val="single" w:sz="4" w:space="0" w:color="000000"/>
               <w:left w:val="single" w:sz="4" w:space="0" w:color="000000"/>
@@ -2073,13 +2232,64 @@
                 <w:szCs w:val="24"/>
                 <w:u w:val="none"/>
               </w:rPr>
-              <w:t>1x day, Monday to Friday, at 4</w:t>
+              <w:t xml:space="preserve">1x day, </w:t>
+            </w:r>
+            <w:r>
+              <w:rPr>
+                <w:b w:val="false"/>
+                <w:bCs w:val="false"/>
+                <w:i w:val="false"/>
+                <w:iCs w:val="false"/>
+                <w:strike w:val="false"/>
+                <w:dstrike w:val="false"/>
+                <w:outline w:val="false"/>
+                <w:shadow w:val="false"/>
+                <w:color w:val="000000"/>
+                <w:sz w:val="24"/>
+                <w:szCs w:val="24"/>
+                <w:u w:val="none"/>
+              </w:rPr>
+              <w:t>weekdays</w:t>
+            </w:r>
+            <w:r>
+              <w:rPr>
+                <w:b w:val="false"/>
+                <w:bCs w:val="false"/>
+                <w:i w:val="false"/>
+                <w:iCs w:val="false"/>
+                <w:strike w:val="false"/>
+                <w:dstrike w:val="false"/>
+                <w:outline w:val="false"/>
+                <w:shadow w:val="false"/>
+                <w:color w:val="000000"/>
+                <w:sz w:val="24"/>
+                <w:szCs w:val="24"/>
+                <w:u w:val="none"/>
+              </w:rPr>
+              <w:t xml:space="preserve"> at </w:t>
+            </w:r>
+            <w:r>
+              <w:rPr>
+                <w:b w:val="false"/>
+                <w:bCs w:val="false"/>
+                <w:i w:val="false"/>
+                <w:iCs w:val="false"/>
+                <w:strike w:val="false"/>
+                <w:dstrike w:val="false"/>
+                <w:outline w:val="false"/>
+                <w:shadow w:val="false"/>
+                <w:color w:val="000000"/>
+                <w:sz w:val="24"/>
+                <w:szCs w:val="24"/>
+                <w:u w:val="none"/>
+              </w:rPr>
+              <w:t>5</w:t>
             </w:r>
           </w:p>
         </w:tc>
         <w:tc>
           <w:tcPr>
-            <w:tcW w:w="1530" w:type="dxa"/>
+            <w:tcW w:w="1531" w:type="dxa"/>
             <w:tcBorders>
               <w:top w:val="single" w:sz="4" w:space="0" w:color="000000"/>
               <w:left w:val="single" w:sz="4" w:space="0" w:color="000000"/>
@@ -2131,7 +2341,7 @@
         </w:tc>
         <w:tc>
           <w:tcPr>
-            <w:tcW w:w="2730" w:type="dxa"/>
+            <w:tcW w:w="2729" w:type="dxa"/>
             <w:tcBorders>
               <w:top w:val="single" w:sz="4" w:space="0" w:color="000000"/>
               <w:left w:val="single" w:sz="4" w:space="0" w:color="000000"/>
@@ -2178,6 +2388,7 @@
                 <w:szCs w:val="24"/>
                 <w:u w:val="none"/>
               </w:rPr>
+              <w:t>0:30 – 1:30 h</w:t>
             </w:r>
           </w:p>
         </w:tc>
@@ -2186,7 +2397,7 @@
         <w:trPr/>
         <w:tc>
           <w:tcPr>
-            <w:tcW w:w="1588" w:type="dxa"/>
+            <w:tcW w:w="1587" w:type="dxa"/>
             <w:tcBorders>
               <w:left w:val="single" w:sz="4" w:space="0" w:color="000000"/>
               <w:bottom w:val="single" w:sz="4" w:space="0" w:color="000000"/>
@@ -2292,7 +2503,7 @@
         <w:trPr/>
         <w:tc>
           <w:tcPr>
-            <w:tcW w:w="1588" w:type="dxa"/>
+            <w:tcW w:w="1587" w:type="dxa"/>
             <w:tcBorders>
               <w:left w:val="single" w:sz="4" w:space="0" w:color="000000"/>
               <w:bottom w:val="single" w:sz="4" w:space="0" w:color="000000"/>
@@ -2541,7 +2752,7 @@
         <w:trPr/>
         <w:tc>
           <w:tcPr>
-            <w:tcW w:w="1588" w:type="dxa"/>
+            <w:tcW w:w="1587" w:type="dxa"/>
             <w:tcBorders>
               <w:left w:val="single" w:sz="4" w:space="0" w:color="000000"/>
               <w:bottom w:val="single" w:sz="4" w:space="0" w:color="000000"/>
@@ -2612,24 +2823,13 @@
               <w:jc w:val="left"/>
               <w:rPr>
                 <w:rFonts w:ascii="Liberation Serif" w:hAnsi="Liberation Serif"/>
-                <w:b w:val="false"/>
-                <w:b w:val="false"/>
-                <w:bCs w:val="false"/>
-                <w:i w:val="false"/>
-                <w:i w:val="false"/>
-                <w:iCs w:val="false"/>
-                <w:strike w:val="false"/>
-                <w:dstrike w:val="false"/>
-                <w:outline w:val="false"/>
-                <w:shadow w:val="false"/>
-                <w:color w:val="000000"/>
-                <w:sz w:val="24"/>
-                <w:szCs w:val="24"/>
-                <w:u w:val="none"/>
-              </w:rPr>
-            </w:pPr>
-            <w:r>
-              <w:rPr>
+                <w:sz w:val="24"/>
+                <w:szCs w:val="24"/>
+              </w:rPr>
+            </w:pPr>
+            <w:r>
+              <w:rPr>
+                <w:rFonts w:ascii="Liberation Serif" w:hAnsi="Liberation Serif"/>
                 <w:b w:val="false"/>
                 <w:bCs w:val="false"/>
                 <w:i w:val="false"/>
@@ -2647,6 +2847,7 @@
             </w:r>
             <w:r>
               <w:rPr>
+                <w:rFonts w:ascii="Liberation Serif" w:hAnsi="Liberation Serif"/>
                 <w:b w:val="false"/>
                 <w:bCs w:val="false"/>
                 <w:i w:val="false"/>
@@ -2664,17 +2865,17 @@
             </w:r>
             <w:r>
               <w:rPr>
-                <w:rFonts w:ascii="Droid Sans Mono;monospace;monospace" w:hAnsi="Droid Sans Mono;monospace;monospace"/>
-                <w:b w:val="false"/>
-                <w:bCs w:val="false"/>
-                <w:i w:val="false"/>
-                <w:iCs w:val="false"/>
-                <w:strike w:val="false"/>
-                <w:dstrike w:val="false"/>
-                <w:outline w:val="false"/>
-                <w:shadow w:val="false"/>
-                <w:color w:val="000000"/>
-                <w:sz w:val="21"/>
+                <w:rFonts w:ascii="Liberation Serif" w:hAnsi="Liberation Serif"/>
+                <w:b w:val="false"/>
+                <w:bCs w:val="false"/>
+                <w:i w:val="false"/>
+                <w:iCs w:val="false"/>
+                <w:strike w:val="false"/>
+                <w:dstrike w:val="false"/>
+                <w:outline w:val="false"/>
+                <w:shadow w:val="false"/>
+                <w:color w:val="000000"/>
+                <w:sz w:val="24"/>
                 <w:szCs w:val="24"/>
                 <w:u w:val="none"/>
                 <w:shd w:fill="FFFFFF" w:val="clear"/>
@@ -2694,59 +2895,28 @@
               <w:jc w:val="left"/>
               <w:rPr>
                 <w:rFonts w:ascii="Liberation Serif" w:hAnsi="Liberation Serif"/>
-                <w:b w:val="false"/>
-                <w:b w:val="false"/>
-                <w:bCs w:val="false"/>
-                <w:i w:val="false"/>
-                <w:i w:val="false"/>
-                <w:iCs w:val="false"/>
-                <w:strike w:val="false"/>
-                <w:dstrike w:val="false"/>
-                <w:outline w:val="false"/>
-                <w:shadow w:val="false"/>
-                <w:color w:val="000000"/>
-                <w:sz w:val="24"/>
-                <w:szCs w:val="24"/>
-                <w:u w:val="none"/>
-              </w:rPr>
-            </w:pPr>
-            <w:r>
-              <w:rPr>
-                <w:rFonts w:ascii="Droid Sans Mono;monospace;monospace" w:hAnsi="Droid Sans Mono;monospace;monospace"/>
-                <w:b w:val="false"/>
-                <w:bCs w:val="false"/>
-                <w:i w:val="false"/>
-                <w:iCs w:val="false"/>
-                <w:strike w:val="false"/>
-                <w:dstrike w:val="false"/>
-                <w:outline w:val="false"/>
-                <w:shadow w:val="false"/>
-                <w:color w:val="000000"/>
-                <w:sz w:val="21"/>
+                <w:sz w:val="24"/>
+                <w:szCs w:val="24"/>
+              </w:rPr>
+            </w:pPr>
+            <w:r>
+              <w:rPr>
+                <w:rFonts w:ascii="Liberation Serif" w:hAnsi="Liberation Serif"/>
+                <w:b w:val="false"/>
+                <w:bCs w:val="false"/>
+                <w:i w:val="false"/>
+                <w:iCs w:val="false"/>
+                <w:strike w:val="false"/>
+                <w:dstrike w:val="false"/>
+                <w:outline w:val="false"/>
+                <w:shadow w:val="false"/>
+                <w:color w:val="000000"/>
+                <w:sz w:val="24"/>
                 <w:szCs w:val="24"/>
                 <w:u w:val="none"/>
                 <w:shd w:fill="FFFFFF" w:val="clear"/>
               </w:rPr>
-              <w:t>T</w:t>
-            </w:r>
-            <w:r>
-              <w:rPr>
-                <w:rFonts w:ascii="Droid Sans Mono;monospace;monospace" w:hAnsi="Droid Sans Mono;monospace;monospace"/>
-                <w:b w:val="false"/>
-                <w:bCs w:val="false"/>
-                <w:i w:val="false"/>
-                <w:iCs w:val="false"/>
-                <w:strike w:val="false"/>
-                <w:dstrike w:val="false"/>
-                <w:outline w:val="false"/>
-                <w:shadow w:val="false"/>
-                <w:color w:val="000000"/>
-                <w:sz w:val="21"/>
-                <w:szCs w:val="24"/>
-                <w:u w:val="none"/>
-                <w:shd w:fill="FFFFFF" w:val="clear"/>
-              </w:rPr>
-              <w:t>he migration_progress table contains information about the partitions that have already been processed</w:t>
+              <w:t>The migration_progress table contains information about the partitions that have already been processed</w:t>
             </w:r>
           </w:p>
         </w:tc>
@@ -2787,7 +2957,7 @@
       </w:pPr>
       <w:r>
         <w:rPr/>
-        <w:t>Importing into the database</w:t>
+        <w:t>Trigger inferences</w:t>
       </w:r>
     </w:p>
     <w:tbl>
@@ -2805,7 +2975,9 @@
       </w:tblPr>
       <w:tblGrid>
         <w:gridCol w:w="1588"/>
-        <w:gridCol w:w="8049"/>
+        <w:gridCol w:w="2683"/>
+        <w:gridCol w:w="2683"/>
+        <w:gridCol w:w="2683"/>
       </w:tblGrid>
       <w:tr>
         <w:trPr/>
@@ -2863,7 +3035,111 @@
         </w:tc>
         <w:tc>
           <w:tcPr>
-            <w:tcW w:w="8049" w:type="dxa"/>
+            <w:tcW w:w="2683" w:type="dxa"/>
+            <w:tcBorders>
+              <w:top w:val="single" w:sz="4" w:space="0" w:color="000000"/>
+              <w:left w:val="single" w:sz="4" w:space="0" w:color="000000"/>
+              <w:bottom w:val="single" w:sz="4" w:space="0" w:color="000000"/>
+            </w:tcBorders>
+          </w:tcPr>
+          <w:p>
+            <w:pPr>
+              <w:pStyle w:val="TableContents"/>
+              <w:widowControl w:val="false"/>
+              <w:bidi w:val="0"/>
+              <w:jc w:val="left"/>
+              <w:rPr>
+                <w:rFonts w:ascii="Liberation Serif" w:hAnsi="Liberation Serif"/>
+                <w:b w:val="false"/>
+                <w:b w:val="false"/>
+                <w:bCs w:val="false"/>
+                <w:i w:val="false"/>
+                <w:i w:val="false"/>
+                <w:iCs w:val="false"/>
+                <w:strike w:val="false"/>
+                <w:dstrike w:val="false"/>
+                <w:outline w:val="false"/>
+                <w:shadow w:val="false"/>
+                <w:color w:val="000000"/>
+                <w:sz w:val="24"/>
+                <w:szCs w:val="24"/>
+                <w:u w:val="none"/>
+              </w:rPr>
+            </w:pPr>
+            <w:r>
+              <w:rPr>
+                <w:b w:val="false"/>
+                <w:bCs w:val="false"/>
+                <w:i w:val="false"/>
+                <w:iCs w:val="false"/>
+                <w:strike w:val="false"/>
+                <w:dstrike w:val="false"/>
+                <w:outline w:val="false"/>
+                <w:shadow w:val="false"/>
+                <w:color w:val="000000"/>
+                <w:sz w:val="24"/>
+                <w:szCs w:val="24"/>
+                <w:u w:val="none"/>
+              </w:rPr>
+              <w:t>1x day, weekdays at 21h</w:t>
+            </w:r>
+          </w:p>
+        </w:tc>
+        <w:tc>
+          <w:tcPr>
+            <w:tcW w:w="2683" w:type="dxa"/>
+            <w:tcBorders>
+              <w:top w:val="single" w:sz="4" w:space="0" w:color="000000"/>
+              <w:left w:val="single" w:sz="4" w:space="0" w:color="000000"/>
+              <w:bottom w:val="single" w:sz="4" w:space="0" w:color="000000"/>
+            </w:tcBorders>
+          </w:tcPr>
+          <w:p>
+            <w:pPr>
+              <w:pStyle w:val="TableContents"/>
+              <w:widowControl w:val="false"/>
+              <w:bidi w:val="0"/>
+              <w:jc w:val="left"/>
+              <w:rPr>
+                <w:rFonts w:ascii="Liberation Serif" w:hAnsi="Liberation Serif"/>
+                <w:b/>
+                <w:b/>
+                <w:bCs/>
+                <w:i w:val="false"/>
+                <w:i w:val="false"/>
+                <w:iCs w:val="false"/>
+                <w:strike w:val="false"/>
+                <w:dstrike w:val="false"/>
+                <w:outline w:val="false"/>
+                <w:shadow w:val="false"/>
+                <w:color w:val="000000"/>
+                <w:sz w:val="24"/>
+                <w:szCs w:val="24"/>
+                <w:u w:val="none"/>
+              </w:rPr>
+            </w:pPr>
+            <w:r>
+              <w:rPr>
+                <w:b/>
+                <w:bCs/>
+                <w:i w:val="false"/>
+                <w:iCs w:val="false"/>
+                <w:strike w:val="false"/>
+                <w:dstrike w:val="false"/>
+                <w:outline w:val="false"/>
+                <w:shadow w:val="false"/>
+                <w:color w:val="000000"/>
+                <w:sz w:val="24"/>
+                <w:szCs w:val="24"/>
+                <w:u w:val="none"/>
+              </w:rPr>
+              <w:t>Duration</w:t>
+            </w:r>
+          </w:p>
+        </w:tc>
+        <w:tc>
+          <w:tcPr>
+            <w:tcW w:w="2683" w:type="dxa"/>
             <w:tcBorders>
               <w:top w:val="single" w:sz="4" w:space="0" w:color="000000"/>
               <w:left w:val="single" w:sz="4" w:space="0" w:color="000000"/>
@@ -2910,6 +3186,7 @@
                 <w:szCs w:val="24"/>
                 <w:u w:val="none"/>
               </w:rPr>
+              <w:t>4:00 – 8:00 h</w:t>
             </w:r>
           </w:p>
         </w:tc>
@@ -2970,6 +3247,7 @@
         <w:tc>
           <w:tcPr>
             <w:tcW w:w="8049" w:type="dxa"/>
+            <w:gridSpan w:val="3"/>
             <w:tcBorders>
               <w:left w:val="single" w:sz="4" w:space="0" w:color="000000"/>
               <w:bottom w:val="single" w:sz="4" w:space="0" w:color="000000"/>
@@ -2985,36 +3263,46 @@
               <w:rPr>
                 <w:rFonts w:ascii="Liberation Serif" w:hAnsi="Liberation Serif"/>
                 <w:b w:val="false"/>
-                <w:b w:val="false"/>
-                <w:bCs w:val="false"/>
-                <w:i w:val="false"/>
-                <w:i w:val="false"/>
-                <w:iCs w:val="false"/>
-                <w:strike w:val="false"/>
-                <w:dstrike w:val="false"/>
-                <w:outline w:val="false"/>
-                <w:shadow w:val="false"/>
-                <w:color w:val="000000"/>
-                <w:sz w:val="24"/>
-                <w:szCs w:val="24"/>
-                <w:u w:val="none"/>
-              </w:rPr>
-            </w:pPr>
-            <w:r>
-              <w:rPr>
-                <w:b w:val="false"/>
-                <w:bCs w:val="false"/>
-                <w:i w:val="false"/>
-                <w:iCs w:val="false"/>
-                <w:strike w:val="false"/>
-                <w:dstrike w:val="false"/>
-                <w:outline w:val="false"/>
-                <w:shadow w:val="false"/>
-                <w:color w:val="000000"/>
-                <w:sz w:val="24"/>
-                <w:szCs w:val="24"/>
-                <w:u w:val="none"/>
-              </w:rPr>
+                <w:color w:val="auto"/>
+                <w:sz w:val="24"/>
+              </w:rPr>
+            </w:pPr>
+            <w:r>
+              <w:rPr>
+                <w:b w:val="false"/>
+                <w:bCs w:val="false"/>
+                <w:i w:val="false"/>
+                <w:iCs w:val="false"/>
+                <w:strike w:val="false"/>
+                <w:dstrike w:val="false"/>
+                <w:outline w:val="false"/>
+                <w:shadow w:val="false"/>
+                <w:color w:val="auto"/>
+                <w:sz w:val="24"/>
+                <w:szCs w:val="24"/>
+                <w:u w:val="none"/>
+              </w:rPr>
+              <w:t xml:space="preserve">Pass the </w:t>
+            </w:r>
+            <w:r>
+              <w:rPr>
+                <w:rFonts w:ascii="Courier new;monospace;Droid Sans Mono;monospace" w:hAnsi="Courier new;monospace;Droid Sans Mono;monospace"/>
+                <w:b w:val="false"/>
+                <w:color w:val="000000"/>
+                <w:sz w:val="20"/>
+                <w:shd w:fill="FFFFFF" w:val="clear"/>
+              </w:rPr>
+              <w:t xml:space="preserve">API_URL </w:t>
+            </w:r>
+            <w:r>
+              <w:rPr>
+                <w:rFonts w:ascii="Courier new;monospace;Droid Sans Mono;monospace" w:hAnsi="Courier new;monospace;Droid Sans Mono;monospace"/>
+                <w:b w:val="false"/>
+                <w:color w:val="000000"/>
+                <w:sz w:val="20"/>
+                <w:shd w:fill="FFFFFF" w:val="clear"/>
+              </w:rPr>
+              <w:t>in docker compose</w:t>
             </w:r>
           </w:p>
         </w:tc>
@@ -3075,6 +3363,7 @@
         <w:tc>
           <w:tcPr>
             <w:tcW w:w="8049" w:type="dxa"/>
+            <w:gridSpan w:val="3"/>
             <w:tcBorders>
               <w:left w:val="single" w:sz="4" w:space="0" w:color="000000"/>
               <w:bottom w:val="single" w:sz="4" w:space="0" w:color="000000"/>
@@ -3085,41 +3374,211 @@
             <w:pPr>
               <w:pStyle w:val="TableContents"/>
               <w:widowControl w:val="false"/>
-              <w:bidi w:val="0"/>
-              <w:jc w:val="left"/>
-              <w:rPr>
-                <w:rFonts w:ascii="Liberation Serif" w:hAnsi="Liberation Serif"/>
-                <w:b w:val="false"/>
-                <w:b w:val="false"/>
-                <w:bCs w:val="false"/>
-                <w:i w:val="false"/>
-                <w:i w:val="false"/>
-                <w:iCs w:val="false"/>
-                <w:strike w:val="false"/>
-                <w:dstrike w:val="false"/>
-                <w:outline w:val="false"/>
-                <w:shadow w:val="false"/>
-                <w:color w:val="000000"/>
-                <w:sz w:val="24"/>
-                <w:szCs w:val="24"/>
-                <w:u w:val="none"/>
-              </w:rPr>
-            </w:pPr>
-            <w:r>
-              <w:rPr>
-                <w:b w:val="false"/>
-                <w:bCs w:val="false"/>
-                <w:i w:val="false"/>
-                <w:iCs w:val="false"/>
-                <w:strike w:val="false"/>
-                <w:dstrike w:val="false"/>
-                <w:outline w:val="false"/>
-                <w:shadow w:val="false"/>
-                <w:color w:val="000000"/>
-                <w:sz w:val="24"/>
-                <w:szCs w:val="24"/>
-                <w:u w:val="none"/>
-              </w:rPr>
+              <w:numPr>
+                <w:ilvl w:val="0"/>
+                <w:numId w:val="8"/>
+              </w:numPr>
+              <w:bidi w:val="0"/>
+              <w:jc w:val="left"/>
+              <w:rPr>
+                <w:rFonts w:ascii="Liberation Serif" w:hAnsi="Liberation Serif"/>
+                <w:b w:val="false"/>
+                <w:b w:val="false"/>
+                <w:bCs w:val="false"/>
+                <w:i w:val="false"/>
+                <w:i w:val="false"/>
+                <w:iCs w:val="false"/>
+                <w:strike w:val="false"/>
+                <w:dstrike w:val="false"/>
+                <w:outline w:val="false"/>
+                <w:shadow w:val="false"/>
+                <w:color w:val="000000"/>
+                <w:sz w:val="24"/>
+                <w:szCs w:val="24"/>
+                <w:u w:val="none"/>
+              </w:rPr>
+            </w:pPr>
+            <w:r>
+              <w:rPr>
+                <w:rFonts w:ascii="Liberation Serif" w:hAnsi="Liberation Serif"/>
+                <w:b w:val="false"/>
+                <w:bCs w:val="false"/>
+                <w:i w:val="false"/>
+                <w:iCs w:val="false"/>
+                <w:strike w:val="false"/>
+                <w:dstrike w:val="false"/>
+                <w:outline w:val="false"/>
+                <w:shadow w:val="false"/>
+                <w:color w:val="000000"/>
+                <w:sz w:val="24"/>
+                <w:szCs w:val="24"/>
+                <w:u w:val="none"/>
+              </w:rPr>
+              <w:t xml:space="preserve">1. </w:t>
+            </w:r>
+            <w:r>
+              <w:rPr>
+                <w:rFonts w:ascii="Liberation Serif" w:hAnsi="Liberation Serif"/>
+                <w:b w:val="false"/>
+                <w:bCs w:val="false"/>
+                <w:i w:val="false"/>
+                <w:iCs w:val="false"/>
+                <w:strike w:val="false"/>
+                <w:dstrike w:val="false"/>
+                <w:outline w:val="false"/>
+                <w:shadow w:val="false"/>
+                <w:color w:val="3B3B3B"/>
+                <w:sz w:val="24"/>
+                <w:szCs w:val="24"/>
+                <w:u w:val="none"/>
+                <w:shd w:fill="FFFFFF" w:val="clear"/>
+              </w:rPr>
+              <w:t>Verifies if the required workflow_reports table exists in the database</w:t>
+            </w:r>
+          </w:p>
+          <w:p>
+            <w:pPr>
+              <w:pStyle w:val="TableContents"/>
+              <w:widowControl w:val="false"/>
+              <w:numPr>
+                <w:ilvl w:val="0"/>
+                <w:numId w:val="8"/>
+              </w:numPr>
+              <w:bidi w:val="0"/>
+              <w:jc w:val="left"/>
+              <w:rPr>
+                <w:rFonts w:ascii="Liberation Serif" w:hAnsi="Liberation Serif"/>
+                <w:b w:val="false"/>
+                <w:b w:val="false"/>
+                <w:bCs w:val="false"/>
+                <w:i w:val="false"/>
+                <w:i w:val="false"/>
+                <w:iCs w:val="false"/>
+                <w:strike w:val="false"/>
+                <w:dstrike w:val="false"/>
+                <w:outline w:val="false"/>
+                <w:shadow w:val="false"/>
+                <w:color w:val="000000"/>
+                <w:sz w:val="24"/>
+                <w:szCs w:val="24"/>
+                <w:u w:val="none"/>
+              </w:rPr>
+            </w:pPr>
+            <w:r>
+              <w:rPr>
+                <w:rFonts w:ascii="Liberation Serif" w:hAnsi="Liberation Serif"/>
+                <w:b w:val="false"/>
+                <w:bCs w:val="false"/>
+                <w:i w:val="false"/>
+                <w:iCs w:val="false"/>
+                <w:strike w:val="false"/>
+                <w:dstrike w:val="false"/>
+                <w:outline w:val="false"/>
+                <w:shadow w:val="false"/>
+                <w:color w:val="3B3B3B"/>
+                <w:sz w:val="24"/>
+                <w:szCs w:val="24"/>
+                <w:u w:val="none"/>
+                <w:shd w:fill="FFFFFF" w:val="clear"/>
+              </w:rPr>
+              <w:t>Identifies which models need to run inferences</w:t>
+            </w:r>
+          </w:p>
+          <w:p>
+            <w:pPr>
+              <w:pStyle w:val="Normal"/>
+              <w:widowControl w:val="false"/>
+              <w:numPr>
+                <w:ilvl w:val="0"/>
+                <w:numId w:val="8"/>
+              </w:numPr>
+              <w:bidi w:val="0"/>
+              <w:jc w:val="left"/>
+              <w:rPr>
+                <w:rFonts w:ascii="Liberation Serif" w:hAnsi="Liberation Serif"/>
+                <w:b w:val="false"/>
+                <w:b w:val="false"/>
+                <w:bCs w:val="false"/>
+                <w:i w:val="false"/>
+                <w:i w:val="false"/>
+                <w:iCs w:val="false"/>
+                <w:strike w:val="false"/>
+                <w:dstrike w:val="false"/>
+                <w:outline w:val="false"/>
+                <w:shadow w:val="false"/>
+                <w:color w:val="3B3B3B"/>
+                <w:sz w:val="24"/>
+                <w:szCs w:val="24"/>
+                <w:u w:val="none"/>
+                <w:shd w:fill="FFFFFF" w:val="clear"/>
+              </w:rPr>
+            </w:pPr>
+            <w:r>
+              <w:rPr>
+                <w:rFonts w:ascii="Liberation Serif" w:hAnsi="Liberation Serif"/>
+                <w:b w:val="false"/>
+                <w:bCs w:val="false"/>
+                <w:i w:val="false"/>
+                <w:iCs w:val="false"/>
+                <w:strike w:val="false"/>
+                <w:dstrike w:val="false"/>
+                <w:outline w:val="false"/>
+                <w:shadow w:val="false"/>
+                <w:color w:val="3B3B3B"/>
+                <w:sz w:val="24"/>
+                <w:szCs w:val="24"/>
+                <w:u w:val="none"/>
+                <w:shd w:fill="FFFFFF" w:val="clear"/>
+              </w:rPr>
+              <w:t>Limits to 2 models per run</w:t>
+            </w:r>
+          </w:p>
+          <w:p>
+            <w:pPr>
+              <w:pStyle w:val="TableContents"/>
+              <w:widowControl w:val="false"/>
+              <w:numPr>
+                <w:ilvl w:val="0"/>
+                <w:numId w:val="8"/>
+              </w:numPr>
+              <w:bidi w:val="0"/>
+              <w:jc w:val="left"/>
+              <w:rPr>
+                <w:rFonts w:ascii="Liberation Serif" w:hAnsi="Liberation Serif"/>
+                <w:b w:val="false"/>
+                <w:b w:val="false"/>
+                <w:bCs w:val="false"/>
+                <w:i w:val="false"/>
+                <w:i w:val="false"/>
+                <w:iCs w:val="false"/>
+                <w:strike w:val="false"/>
+                <w:dstrike w:val="false"/>
+                <w:outline w:val="false"/>
+                <w:shadow w:val="false"/>
+                <w:color w:val="000000"/>
+                <w:sz w:val="24"/>
+                <w:szCs w:val="24"/>
+                <w:u w:val="none"/>
+              </w:rPr>
+            </w:pPr>
+            <w:r>
+              <w:rPr>
+                <w:rFonts w:ascii="Liberation Serif" w:hAnsi="Liberation Serif"/>
+                <w:b w:val="false"/>
+                <w:bCs w:val="false"/>
+                <w:i w:val="false"/>
+                <w:iCs w:val="false"/>
+                <w:strike w:val="false"/>
+                <w:dstrike w:val="false"/>
+                <w:outline w:val="false"/>
+                <w:shadow w:val="false"/>
+                <w:color w:val="3B3B3B"/>
+                <w:sz w:val="24"/>
+                <w:szCs w:val="24"/>
+                <w:u w:val="none"/>
+                <w:shd w:fill="FFFFFF" w:val="clear"/>
+              </w:rPr>
+              <w:t>Triggers inference jobs for each model that needs processing</w:t>
             </w:r>
           </w:p>
         </w:tc>
@@ -3180,6 +3639,7 @@
         <w:tc>
           <w:tcPr>
             <w:tcW w:w="8049" w:type="dxa"/>
+            <w:gridSpan w:val="3"/>
             <w:tcBorders>
               <w:left w:val="single" w:sz="4" w:space="0" w:color="000000"/>
               <w:bottom w:val="single" w:sz="4" w:space="0" w:color="000000"/>
@@ -3225,6 +3685,7 @@
                 <w:szCs w:val="24"/>
                 <w:u w:val="none"/>
               </w:rPr>
+              <w:t>Inferences are stored in the database, table model_inference_results_pt_record</w:t>
             </w:r>
           </w:p>
         </w:tc>
@@ -4153,6 +4614,125 @@
     </w:lvl>
   </w:abstractNum>
   <w:abstractNum w:abstractNumId="8">
+    <w:lvl w:ilvl="0">
+      <w:start w:val="1"/>
+      <w:numFmt w:val="decimal"/>
+      <w:lvlText w:val="%1."/>
+      <w:lvlJc w:val="left"/>
+      <w:pPr>
+        <w:tabs>
+          <w:tab w:val="num" w:pos="720"/>
+        </w:tabs>
+        <w:ind w:left="720" w:hanging="360"/>
+      </w:pPr>
+      <w:rPr/>
+    </w:lvl>
+    <w:lvl w:ilvl="1">
+      <w:start w:val="1"/>
+      <w:numFmt w:val="decimal"/>
+      <w:lvlText w:val="%2."/>
+      <w:lvlJc w:val="left"/>
+      <w:pPr>
+        <w:tabs>
+          <w:tab w:val="num" w:pos="1080"/>
+        </w:tabs>
+        <w:ind w:left="1080" w:hanging="360"/>
+      </w:pPr>
+      <w:rPr/>
+    </w:lvl>
+    <w:lvl w:ilvl="2">
+      <w:start w:val="1"/>
+      <w:numFmt w:val="decimal"/>
+      <w:lvlText w:val="%3."/>
+      <w:lvlJc w:val="left"/>
+      <w:pPr>
+        <w:tabs>
+          <w:tab w:val="num" w:pos="1440"/>
+        </w:tabs>
+        <w:ind w:left="1440" w:hanging="360"/>
+      </w:pPr>
+      <w:rPr/>
+    </w:lvl>
+    <w:lvl w:ilvl="3">
+      <w:start w:val="1"/>
+      <w:numFmt w:val="decimal"/>
+      <w:lvlText w:val="%4."/>
+      <w:lvlJc w:val="left"/>
+      <w:pPr>
+        <w:tabs>
+          <w:tab w:val="num" w:pos="1800"/>
+        </w:tabs>
+        <w:ind w:left="1800" w:hanging="360"/>
+      </w:pPr>
+      <w:rPr/>
+    </w:lvl>
+    <w:lvl w:ilvl="4">
+      <w:start w:val="1"/>
+      <w:numFmt w:val="decimal"/>
+      <w:lvlText w:val="%5."/>
+      <w:lvlJc w:val="left"/>
+      <w:pPr>
+        <w:tabs>
+          <w:tab w:val="num" w:pos="2160"/>
+        </w:tabs>
+        <w:ind w:left="2160" w:hanging="360"/>
+      </w:pPr>
+      <w:rPr/>
+    </w:lvl>
+    <w:lvl w:ilvl="5">
+      <w:start w:val="1"/>
+      <w:numFmt w:val="decimal"/>
+      <w:lvlText w:val="%6."/>
+      <w:lvlJc w:val="left"/>
+      <w:pPr>
+        <w:tabs>
+          <w:tab w:val="num" w:pos="2520"/>
+        </w:tabs>
+        <w:ind w:left="2520" w:hanging="360"/>
+      </w:pPr>
+      <w:rPr/>
+    </w:lvl>
+    <w:lvl w:ilvl="6">
+      <w:start w:val="1"/>
+      <w:numFmt w:val="decimal"/>
+      <w:lvlText w:val="%7."/>
+      <w:lvlJc w:val="left"/>
+      <w:pPr>
+        <w:tabs>
+          <w:tab w:val="num" w:pos="2880"/>
+        </w:tabs>
+        <w:ind w:left="2880" w:hanging="360"/>
+      </w:pPr>
+      <w:rPr/>
+    </w:lvl>
+    <w:lvl w:ilvl="7">
+      <w:start w:val="1"/>
+      <w:numFmt w:val="decimal"/>
+      <w:lvlText w:val="%8."/>
+      <w:lvlJc w:val="left"/>
+      <w:pPr>
+        <w:tabs>
+          <w:tab w:val="num" w:pos="3240"/>
+        </w:tabs>
+        <w:ind w:left="3240" w:hanging="360"/>
+      </w:pPr>
+      <w:rPr/>
+    </w:lvl>
+    <w:lvl w:ilvl="8">
+      <w:start w:val="1"/>
+      <w:numFmt w:val="decimal"/>
+      <w:lvlText w:val="%9."/>
+      <w:lvlJc w:val="left"/>
+      <w:pPr>
+        <w:tabs>
+          <w:tab w:val="num" w:pos="3600"/>
+        </w:tabs>
+        <w:ind w:left="3600" w:hanging="360"/>
+      </w:pPr>
+      <w:rPr/>
+    </w:lvl>
+  </w:abstractNum>
+  <w:abstractNum w:abstractNumId="9">
     <w:lvl w:ilvl="0">
       <w:start w:val="1"/>
       <w:numFmt w:val="none"/>
@@ -4294,6 +4874,9 @@
   </w:num>
   <w:num w:numId="8">
     <w:abstractNumId w:val="8"/>
+  </w:num>
+  <w:num w:numId="9">
+    <w:abstractNumId w:val="9"/>
   </w:num>
 </w:numbering>
 </file>

</xml_diff>

<commit_message>
Moved backup to Saturday at 21h
</commit_message>
<xml_diff>
--- a/docs/automation_concept.docx
+++ b/docs/automation_concept.docx
@@ -303,24 +303,7 @@
                 <w:szCs w:val="24"/>
                 <w:u w:val="none"/>
               </w:rPr>
-              <w:t xml:space="preserve">1 x </w:t>
-            </w:r>
-            <w:r>
-              <w:rPr>
-                <w:b w:val="false"/>
-                <w:bCs w:val="false"/>
-                <w:i w:val="false"/>
-                <w:iCs w:val="false"/>
-                <w:strike w:val="false"/>
-                <w:dstrike w:val="false"/>
-                <w:outline w:val="false"/>
-                <w:shadow w:val="false"/>
-                <w:color w:val="000000"/>
-                <w:sz w:val="24"/>
-                <w:szCs w:val="24"/>
-                <w:u w:val="none"/>
-              </w:rPr>
-              <w:t>day, weekdays at 4h</w:t>
+              <w:t>1 x day, weekdays at 4h</w:t>
             </w:r>
           </w:p>
         </w:tc>
@@ -1218,41 +1201,41 @@
                 <w:szCs w:val="24"/>
                 <w:u w:val="none"/>
               </w:rPr>
-              <w:t>1 x week,</w:t>
-            </w:r>
-            <w:r>
-              <w:rPr>
-                <w:b w:val="false"/>
-                <w:bCs w:val="false"/>
-                <w:i w:val="false"/>
-                <w:iCs w:val="false"/>
-                <w:strike w:val="false"/>
-                <w:dstrike w:val="false"/>
-                <w:outline w:val="false"/>
-                <w:shadow w:val="false"/>
-                <w:color w:val="000000"/>
-                <w:sz w:val="24"/>
-                <w:szCs w:val="24"/>
-                <w:u w:val="none"/>
-              </w:rPr>
-              <w:t xml:space="preserve"> </w:t>
-            </w:r>
-            <w:r>
-              <w:rPr>
-                <w:b w:val="false"/>
-                <w:bCs w:val="false"/>
-                <w:i w:val="false"/>
-                <w:iCs w:val="false"/>
-                <w:strike w:val="false"/>
-                <w:dstrike w:val="false"/>
-                <w:outline w:val="false"/>
-                <w:shadow w:val="false"/>
-                <w:color w:val="000000"/>
-                <w:sz w:val="24"/>
-                <w:szCs w:val="24"/>
-                <w:u w:val="none"/>
-              </w:rPr>
-              <w:t>Friday at 21h</w:t>
+              <w:t xml:space="preserve">1 x week, </w:t>
+            </w:r>
+            <w:r>
+              <w:rPr>
+                <w:b w:val="false"/>
+                <w:bCs w:val="false"/>
+                <w:i w:val="false"/>
+                <w:iCs w:val="false"/>
+                <w:strike w:val="false"/>
+                <w:dstrike w:val="false"/>
+                <w:outline w:val="false"/>
+                <w:shadow w:val="false"/>
+                <w:color w:val="000000"/>
+                <w:sz w:val="24"/>
+                <w:szCs w:val="24"/>
+                <w:u w:val="none"/>
+              </w:rPr>
+              <w:t>Saturday</w:t>
+            </w:r>
+            <w:r>
+              <w:rPr>
+                <w:b w:val="false"/>
+                <w:bCs w:val="false"/>
+                <w:i w:val="false"/>
+                <w:iCs w:val="false"/>
+                <w:strike w:val="false"/>
+                <w:dstrike w:val="false"/>
+                <w:outline w:val="false"/>
+                <w:shadow w:val="false"/>
+                <w:color w:val="000000"/>
+                <w:sz w:val="24"/>
+                <w:szCs w:val="24"/>
+                <w:u w:val="none"/>
+              </w:rPr>
+              <w:t xml:space="preserve"> at 21h</w:t>
             </w:r>
           </w:p>
         </w:tc>
@@ -2232,58 +2215,7 @@
                 <w:szCs w:val="24"/>
                 <w:u w:val="none"/>
               </w:rPr>
-              <w:t xml:space="preserve">1x day, </w:t>
-            </w:r>
-            <w:r>
-              <w:rPr>
-                <w:b w:val="false"/>
-                <w:bCs w:val="false"/>
-                <w:i w:val="false"/>
-                <w:iCs w:val="false"/>
-                <w:strike w:val="false"/>
-                <w:dstrike w:val="false"/>
-                <w:outline w:val="false"/>
-                <w:shadow w:val="false"/>
-                <w:color w:val="000000"/>
-                <w:sz w:val="24"/>
-                <w:szCs w:val="24"/>
-                <w:u w:val="none"/>
-              </w:rPr>
-              <w:t>weekdays</w:t>
-            </w:r>
-            <w:r>
-              <w:rPr>
-                <w:b w:val="false"/>
-                <w:bCs w:val="false"/>
-                <w:i w:val="false"/>
-                <w:iCs w:val="false"/>
-                <w:strike w:val="false"/>
-                <w:dstrike w:val="false"/>
-                <w:outline w:val="false"/>
-                <w:shadow w:val="false"/>
-                <w:color w:val="000000"/>
-                <w:sz w:val="24"/>
-                <w:szCs w:val="24"/>
-                <w:u w:val="none"/>
-              </w:rPr>
-              <w:t xml:space="preserve"> at </w:t>
-            </w:r>
-            <w:r>
-              <w:rPr>
-                <w:b w:val="false"/>
-                <w:bCs w:val="false"/>
-                <w:i w:val="false"/>
-                <w:iCs w:val="false"/>
-                <w:strike w:val="false"/>
-                <w:dstrike w:val="false"/>
-                <w:outline w:val="false"/>
-                <w:shadow w:val="false"/>
-                <w:color w:val="000000"/>
-                <w:sz w:val="24"/>
-                <w:szCs w:val="24"/>
-                <w:u w:val="none"/>
-              </w:rPr>
-              <w:t>5</w:t>
+              <w:t>1x day, weekdays at 5</w:t>
             </w:r>
           </w:p>
         </w:tc>
@@ -2829,7 +2761,6 @@
             </w:pPr>
             <w:r>
               <w:rPr>
-                <w:rFonts w:ascii="Liberation Serif" w:hAnsi="Liberation Serif"/>
                 <w:b w:val="false"/>
                 <w:bCs w:val="false"/>
                 <w:i w:val="false"/>
@@ -2847,7 +2778,6 @@
             </w:r>
             <w:r>
               <w:rPr>
-                <w:rFonts w:ascii="Liberation Serif" w:hAnsi="Liberation Serif"/>
                 <w:b w:val="false"/>
                 <w:bCs w:val="false"/>
                 <w:i w:val="false"/>
@@ -2865,7 +2795,6 @@
             </w:r>
             <w:r>
               <w:rPr>
-                <w:rFonts w:ascii="Liberation Serif" w:hAnsi="Liberation Serif"/>
                 <w:b w:val="false"/>
                 <w:bCs w:val="false"/>
                 <w:i w:val="false"/>
@@ -2901,7 +2830,6 @@
             </w:pPr>
             <w:r>
               <w:rPr>
-                <w:rFonts w:ascii="Liberation Serif" w:hAnsi="Liberation Serif"/>
                 <w:b w:val="false"/>
                 <w:bCs w:val="false"/>
                 <w:i w:val="false"/>
@@ -3263,6 +3191,7 @@
               <w:rPr>
                 <w:rFonts w:ascii="Liberation Serif" w:hAnsi="Liberation Serif"/>
                 <w:b w:val="false"/>
+                <w:b w:val="false"/>
                 <w:color w:val="auto"/>
                 <w:sz w:val="24"/>
               </w:rPr>
@@ -3292,17 +3221,7 @@
                 <w:sz w:val="20"/>
                 <w:shd w:fill="FFFFFF" w:val="clear"/>
               </w:rPr>
-              <w:t xml:space="preserve">API_URL </w:t>
-            </w:r>
-            <w:r>
-              <w:rPr>
-                <w:rFonts w:ascii="Courier new;monospace;Droid Sans Mono;monospace" w:hAnsi="Courier new;monospace;Droid Sans Mono;monospace"/>
-                <w:b w:val="false"/>
-                <w:color w:val="000000"/>
-                <w:sz w:val="20"/>
-                <w:shd w:fill="FFFFFF" w:val="clear"/>
-              </w:rPr>
-              <w:t>in docker compose</w:t>
+              <w:t>API_URL in docker compose</w:t>
             </w:r>
           </w:p>
         </w:tc>
@@ -3400,7 +3319,6 @@
             </w:pPr>
             <w:r>
               <w:rPr>
-                <w:rFonts w:ascii="Liberation Serif" w:hAnsi="Liberation Serif"/>
                 <w:b w:val="false"/>
                 <w:bCs w:val="false"/>
                 <w:i w:val="false"/>
@@ -3418,7 +3336,6 @@
             </w:r>
             <w:r>
               <w:rPr>
-                <w:rFonts w:ascii="Liberation Serif" w:hAnsi="Liberation Serif"/>
                 <w:b w:val="false"/>
                 <w:bCs w:val="false"/>
                 <w:i w:val="false"/>
@@ -3466,7 +3383,6 @@
             </w:pPr>
             <w:r>
               <w:rPr>
-                <w:rFonts w:ascii="Liberation Serif" w:hAnsi="Liberation Serif"/>
                 <w:b w:val="false"/>
                 <w:bCs w:val="false"/>
                 <w:i w:val="false"/>
@@ -3515,7 +3431,6 @@
             </w:pPr>
             <w:r>
               <w:rPr>
-                <w:rFonts w:ascii="Liberation Serif" w:hAnsi="Liberation Serif"/>
                 <w:b w:val="false"/>
                 <w:bCs w:val="false"/>
                 <w:i w:val="false"/>
@@ -3563,7 +3478,6 @@
             </w:pPr>
             <w:r>
               <w:rPr>
-                <w:rFonts w:ascii="Liberation Serif" w:hAnsi="Liberation Serif"/>
                 <w:b w:val="false"/>
                 <w:bCs w:val="false"/>
                 <w:i w:val="false"/>

</xml_diff>

<commit_message>
Run create report before and after running inferences
</commit_message>
<xml_diff>
--- a/docs/automation_concept.docx
+++ b/docs/automation_concept.docx
@@ -303,7 +303,41 @@
                 <w:szCs w:val="24"/>
                 <w:u w:val="none"/>
               </w:rPr>
-              <w:t>1 x day, weekdays at 4h</w:t>
+              <w:t xml:space="preserve">1 x day, weekdays at </w:t>
+            </w:r>
+            <w:r>
+              <w:rPr>
+                <w:b w:val="false"/>
+                <w:bCs w:val="false"/>
+                <w:i w:val="false"/>
+                <w:iCs w:val="false"/>
+                <w:strike w:val="false"/>
+                <w:dstrike w:val="false"/>
+                <w:outline w:val="false"/>
+                <w:shadow w:val="false"/>
+                <w:color w:val="000000"/>
+                <w:sz w:val="24"/>
+                <w:szCs w:val="24"/>
+                <w:u w:val="none"/>
+              </w:rPr>
+              <w:t xml:space="preserve">20h30 and </w:t>
+            </w:r>
+            <w:r>
+              <w:rPr>
+                <w:b w:val="false"/>
+                <w:bCs w:val="false"/>
+                <w:i w:val="false"/>
+                <w:iCs w:val="false"/>
+                <w:strike w:val="false"/>
+                <w:dstrike w:val="false"/>
+                <w:outline w:val="false"/>
+                <w:shadow w:val="false"/>
+                <w:color w:val="000000"/>
+                <w:sz w:val="24"/>
+                <w:szCs w:val="24"/>
+                <w:u w:val="none"/>
+              </w:rPr>
+              <w:t>4h</w:t>
             </w:r>
           </w:p>
         </w:tc>
@@ -1201,41 +1235,7 @@
                 <w:szCs w:val="24"/>
                 <w:u w:val="none"/>
               </w:rPr>
-              <w:t xml:space="preserve">1 x week, </w:t>
-            </w:r>
-            <w:r>
-              <w:rPr>
-                <w:b w:val="false"/>
-                <w:bCs w:val="false"/>
-                <w:i w:val="false"/>
-                <w:iCs w:val="false"/>
-                <w:strike w:val="false"/>
-                <w:dstrike w:val="false"/>
-                <w:outline w:val="false"/>
-                <w:shadow w:val="false"/>
-                <w:color w:val="000000"/>
-                <w:sz w:val="24"/>
-                <w:szCs w:val="24"/>
-                <w:u w:val="none"/>
-              </w:rPr>
-              <w:t>Saturday</w:t>
-            </w:r>
-            <w:r>
-              <w:rPr>
-                <w:b w:val="false"/>
-                <w:bCs w:val="false"/>
-                <w:i w:val="false"/>
-                <w:iCs w:val="false"/>
-                <w:strike w:val="false"/>
-                <w:dstrike w:val="false"/>
-                <w:outline w:val="false"/>
-                <w:shadow w:val="false"/>
-                <w:color w:val="000000"/>
-                <w:sz w:val="24"/>
-                <w:szCs w:val="24"/>
-                <w:u w:val="none"/>
-              </w:rPr>
-              <w:t xml:space="preserve"> at 21h</w:t>
+              <w:t>1 x week, Saturday at 21h</w:t>
             </w:r>
           </w:p>
         </w:tc>

</xml_diff>